<commit_message>
nas-selfcommit: 12 Datei(en) 2026-09-19 11:00
</commit_message>
<xml_diff>
--- a/docs/konzepte/260919-Briefing-IT-Ingenieur-JANS-AI-Zentrum/260919-Briefing-IT-Ingenieur-JANS-AI-Zentrum.docx
+++ b/docs/konzepte/260919-Briefing-IT-Ingenieur-JANS-AI-Zentrum/260919-Briefing-IT-Ingenieur-JANS-AI-Zentrum.docx
@@ -72,10 +72,10 @@
         <w:rPr>
           <w:b/>
         </w:rPr>
-        <w:t>00.5 Was zu offerieren ist.</w:t>
+        <w:t>00.5 Ein kleiner Kern zuerst.</w:t>
       </w:r>
       <w:r>
-        <w:t xml:space="preserve"> Elf Leistungspakete (AP0 bis AP10) in drei Stufen. AP0, Audit und Zielarchitektur, ist eigenständig beauftragbar. Darauf folgen Festpreise oder Kostendächer je Paket und ein Wartungsvertrag.</w:t>
+        <w:t xml:space="preserve"> Stufe 1 beseitigt nur die kritischen Befunde, auf möglichst wenig neuer Infrastruktur. Jede Ausbaustufe danach braucht einen geschäftlichen Auslöser und eine eigene Freigabe. Gesucht ist kein Grossprojekt, sondern ein tragfähiger Kern, der wachsen kann.</w:t>
       </w:r>
     </w:p>
     <w:p>
@@ -83,10 +83,10 @@
         <w:rPr>
           <w:b/>
         </w:rPr>
-        <w:t>00.6 Wie offeriert wird.</w:t>
+        <w:t>00.6 Was zu offerieren ist.</w:t>
       </w:r>
       <w:r>
-        <w:t xml:space="preserve"> Mit mindestens zwei Architekturvarianten, einem Preisblatt je Paket, den Betriebskosten über drei Jahre und den Antworten auf den Fragenkatalog in Abschnitt 10. Offertfrist: ________________.</w:t>
+        <w:t xml:space="preserve"> Elf Pakete für Stufe 1 (AP0 bis AP10) und vier Ausbaupakete (AP11 bis AP14). AP0, Audit und Zielarchitektur mit Sofortmassnahmen, ist eigenständig beauftragbar. Offeriert wird je Paket, nicht je Hub. Offertfrist: ________________.</w:t>
       </w:r>
     </w:p>
     <w:p>
@@ -121,7 +121,7 @@
     </w:p>
     <w:tbl>
       <w:tblPr>
-        <w:tblW w:type="auto" w:w="0"/>
+        <w:tblW w:type="dxa" w:w="9639"/>
         <w:tblLayout w:type="fixed"/>
         <w:tblLook w:firstColumn="1" w:firstRow="1" w:lastColumn="0" w:lastRow="0" w:noHBand="0" w:noVBand="1" w:val="04A0"/>
         <w:tblBorders>
@@ -134,8 +134,8 @@
         </w:tblBorders>
       </w:tblPr>
       <w:tblGrid>
-        <w:gridCol w:w="4819"/>
-        <w:gridCol w:w="4819"/>
+        <w:gridCol w:w="3118"/>
+        <w:gridCol w:w="6520"/>
       </w:tblGrid>
       <w:tr>
         <w:trPr>
@@ -143,7 +143,7 @@
         </w:trPr>
         <w:tc>
           <w:tcPr>
-            <w:tcW w:type="dxa" w:w="3402"/>
+            <w:tcW w:type="dxa" w:w="3118"/>
           </w:tcPr>
           <w:p>
             <w:pPr>
@@ -161,7 +161,7 @@
         </w:tc>
         <w:tc>
           <w:tcPr>
-            <w:tcW w:type="dxa" w:w="6236"/>
+            <w:tcW w:type="dxa" w:w="6520"/>
           </w:tcPr>
           <w:p>
             <w:pPr>
@@ -184,7 +184,7 @@
         </w:trPr>
         <w:tc>
           <w:tcPr>
-            <w:tcW w:type="dxa" w:w="3402"/>
+            <w:tcW w:type="dxa" w:w="3118"/>
           </w:tcPr>
           <w:p>
             <w:pPr>
@@ -201,7 +201,7 @@
         </w:tc>
         <w:tc>
           <w:tcPr>
-            <w:tcW w:type="dxa" w:w="6236"/>
+            <w:tcW w:type="dxa" w:w="6520"/>
           </w:tcPr>
           <w:p>
             <w:pPr>
@@ -223,7 +223,7 @@
         </w:trPr>
         <w:tc>
           <w:tcPr>
-            <w:tcW w:type="dxa" w:w="3402"/>
+            <w:tcW w:type="dxa" w:w="3118"/>
           </w:tcPr>
           <w:p>
             <w:pPr>
@@ -240,7 +240,7 @@
         </w:tc>
         <w:tc>
           <w:tcPr>
-            <w:tcW w:type="dxa" w:w="6236"/>
+            <w:tcW w:type="dxa" w:w="6520"/>
           </w:tcPr>
           <w:p>
             <w:pPr>
@@ -262,7 +262,7 @@
         </w:trPr>
         <w:tc>
           <w:tcPr>
-            <w:tcW w:type="dxa" w:w="3402"/>
+            <w:tcW w:type="dxa" w:w="3118"/>
           </w:tcPr>
           <w:p>
             <w:pPr>
@@ -279,7 +279,7 @@
         </w:tc>
         <w:tc>
           <w:tcPr>
-            <w:tcW w:type="dxa" w:w="6236"/>
+            <w:tcW w:type="dxa" w:w="6520"/>
           </w:tcPr>
           <w:p>
             <w:pPr>
@@ -301,7 +301,7 @@
         </w:trPr>
         <w:tc>
           <w:tcPr>
-            <w:tcW w:type="dxa" w:w="3402"/>
+            <w:tcW w:type="dxa" w:w="3118"/>
           </w:tcPr>
           <w:p>
             <w:pPr>
@@ -318,7 +318,7 @@
         </w:tc>
         <w:tc>
           <w:tcPr>
-            <w:tcW w:type="dxa" w:w="6236"/>
+            <w:tcW w:type="dxa" w:w="6520"/>
           </w:tcPr>
           <w:p>
             <w:pPr>
@@ -340,7 +340,7 @@
         </w:trPr>
         <w:tc>
           <w:tcPr>
-            <w:tcW w:type="dxa" w:w="3402"/>
+            <w:tcW w:type="dxa" w:w="3118"/>
           </w:tcPr>
           <w:p>
             <w:pPr>
@@ -357,7 +357,7 @@
         </w:tc>
         <w:tc>
           <w:tcPr>
-            <w:tcW w:type="dxa" w:w="6236"/>
+            <w:tcW w:type="dxa" w:w="6520"/>
           </w:tcPr>
           <w:p>
             <w:pPr>
@@ -379,7 +379,7 @@
         </w:trPr>
         <w:tc>
           <w:tcPr>
-            <w:tcW w:type="dxa" w:w="3402"/>
+            <w:tcW w:type="dxa" w:w="3118"/>
           </w:tcPr>
           <w:p>
             <w:pPr>
@@ -396,7 +396,7 @@
         </w:tc>
         <w:tc>
           <w:tcPr>
-            <w:tcW w:type="dxa" w:w="6236"/>
+            <w:tcW w:type="dxa" w:w="6520"/>
           </w:tcPr>
           <w:p>
             <w:pPr>
@@ -418,7 +418,7 @@
         </w:trPr>
         <w:tc>
           <w:tcPr>
-            <w:tcW w:type="dxa" w:w="3402"/>
+            <w:tcW w:type="dxa" w:w="3118"/>
           </w:tcPr>
           <w:p>
             <w:pPr>
@@ -435,7 +435,7 @@
         </w:tc>
         <w:tc>
           <w:tcPr>
-            <w:tcW w:type="dxa" w:w="6236"/>
+            <w:tcW w:type="dxa" w:w="6520"/>
           </w:tcPr>
           <w:p>
             <w:pPr>
@@ -457,7 +457,7 @@
         </w:trPr>
         <w:tc>
           <w:tcPr>
-            <w:tcW w:type="dxa" w:w="3402"/>
+            <w:tcW w:type="dxa" w:w="3118"/>
           </w:tcPr>
           <w:p>
             <w:pPr>
@@ -474,7 +474,7 @@
         </w:tc>
         <w:tc>
           <w:tcPr>
-            <w:tcW w:type="dxa" w:w="6236"/>
+            <w:tcW w:type="dxa" w:w="6520"/>
           </w:tcPr>
           <w:p>
             <w:pPr>
@@ -496,7 +496,7 @@
         </w:trPr>
         <w:tc>
           <w:tcPr>
-            <w:tcW w:type="dxa" w:w="3402"/>
+            <w:tcW w:type="dxa" w:w="3118"/>
           </w:tcPr>
           <w:p>
             <w:pPr>
@@ -513,7 +513,7 @@
         </w:tc>
         <w:tc>
           <w:tcPr>
-            <w:tcW w:type="dxa" w:w="6236"/>
+            <w:tcW w:type="dxa" w:w="6520"/>
           </w:tcPr>
           <w:p>
             <w:pPr>
@@ -535,7 +535,7 @@
         </w:trPr>
         <w:tc>
           <w:tcPr>
-            <w:tcW w:type="dxa" w:w="3402"/>
+            <w:tcW w:type="dxa" w:w="3118"/>
           </w:tcPr>
           <w:p>
             <w:pPr>
@@ -552,7 +552,7 @@
         </w:tc>
         <w:tc>
           <w:tcPr>
-            <w:tcW w:type="dxa" w:w="6236"/>
+            <w:tcW w:type="dxa" w:w="6520"/>
           </w:tcPr>
           <w:p>
             <w:pPr>
@@ -577,7 +577,7 @@
         <w:t>01.3 Das Geschäftsmodell.</w:t>
       </w:r>
       <w:r>
-        <w:t xml:space="preserve"> Sechs produktisierte Dienstleistungen stehen im Service-Katalog: Machbarkeits-Studio, Immobilienbewertung, Ankaufsprüfung, Bauleitungs-Backend, Wettbewerbs-Fabrik, Energie-Vorabklärung. Ziel sind Fixpreisprodukte, ein Backend für Partnerbüros und interaktive, gehostete Studien für Bauherrschaften. Dafür braucht es Mehrbenutzerbetrieb, Mandantentrennung und ein Kundenportal. Nichts davon ist heute vorhanden.</w:t>
+        <w:t xml:space="preserve"> Sechs produktisierte Dienstleistungen stehen im Service-Katalog: Machbarkeits-Studio, Immobilienbewertung, Ankaufsprüfung, Bauleitungs-Backend, Wettbewerbs-Fabrik, Energie-Vorabklärung. Ziel sind Fixpreisprodukte, ein Backend für Partnerbüros und interaktive, gehostete Studien für Bauherrschaften. Dafür braucht es später Mehrbenutzerbetrieb, Mandantentrennung und ein Kundenportal. Nichts davon ist heute vorhanden.</w:t>
       </w:r>
     </w:p>
     <w:p>
@@ -588,7 +588,7 @@
         <w:t>01.4 Sie beginnen nicht bei null.</w:t>
       </w:r>
       <w:r>
-        <w:t xml:space="preserve"> Der Hub hat sich selbst gründlich untersucht: Hub-Audit vom 12.08.2026, Spec zur Laufzeitschicht vom 30.08.2026, Systemanalyse vom 11.09.2026 mit Zielbild und Migrationsplan in fünf Etappen, dazu eine Betriebs-Chronik mit 95 dokumentierten Vorfällen. Diese Unterlagen und der Befundkatalog vom 19.09.2026 stehen nach Unterzeichnung einer Geheimhaltungsvereinbarung zur Verfügung.</w:t>
+        <w:t xml:space="preserve"> Der Hub hat sich selbst gründlich untersucht: Hub-Audit vom 12.08.2026, Spec zur Laufzeitschicht vom 30.08.2026, Systemanalyse vom 11.09.2026 mit Zielbild und Migrationsplan, dazu eine Betriebs-Chronik mit 95 dokumentierten Vorfällen. Diese Unterlagen und der Befundkatalog vom 19.09.2026 stehen nach Unterzeichnung einer Geheimhaltungsvereinbarung zur Verfügung.</w:t>
       </w:r>
     </w:p>
     <w:p>
@@ -618,7 +618,7 @@
         <w:t>02.2 Erhalten: die Betriebskultur.</w:t>
       </w:r>
       <w:r>
-        <w:t xml:space="preserve"> Jeder Vorfall ist mit Messwert, Ursache und Lehre dokumentiert. Eingriffe sind umkehrbar, Zahlungen ausgeschlossen, heikle Aufgaben laufen nur nach Freigabe. Diese Regeln sind die Anforderungen an die neue Plattform.</w:t>
+        <w:t xml:space="preserve"> Jeder Vorfall ist mit Messwert, Ursache und Lehre dokumentiert. Eingriffe sind umkehrbar, Zahlungen ausgeschlossen, heikle Aufgaben laufen nur nach Freigabe. Diese Regeln sind die Anforderungen an die neue Plattform, künftig technisch durchgesetzt statt als Text.</w:t>
       </w:r>
     </w:p>
     <w:p>
@@ -774,12 +774,23 @@
         <w:rPr>
           <w:b/>
         </w:rPr>
-        <w:t>04.2 Die Hubs.</w:t>
+        <w:t>04.2 Hubs sind Grenzen, keine Systeme.</w:t>
+      </w:r>
+      <w:r>
+        <w:t xml:space="preserve"> Ein Hub ist ein Namensraum mit eigenem Berechtigungsprofil, eigener Dienstidentität und eigenem Datenraum. Technisch erzwungen werden wenige Vertrauenszonen: die Plattform, eine Inhaber-Zone für Finanzen, Stilkorpus und Kontaktregister, die Projekt- und Kundendaten je Projekt und Rechtsträger, das mandantenneutrale Wissen mit einer Unterzone für lizenzgebundene Inhalte, und die Aussenzone Portal.</w:t>
+      </w:r>
+    </w:p>
+    <w:p>
+      <w:r>
+        <w:rPr>
+          <w:b/>
+        </w:rPr>
+        <w:t>04.3 Die Hubs in drei Gruppen.</w:t>
       </w:r>
     </w:p>
     <w:tbl>
       <w:tblPr>
-        <w:tblW w:type="auto" w:w="0"/>
+        <w:tblW w:type="dxa" w:w="9639"/>
         <w:tblLayout w:type="fixed"/>
         <w:tblLook w:firstColumn="1" w:firstRow="1" w:lastColumn="0" w:lastRow="0" w:noHBand="0" w:noVBand="1" w:val="04A0"/>
         <w:tblBorders>
@@ -792,10 +803,10 @@
         </w:tblBorders>
       </w:tblPr>
       <w:tblGrid>
-        <w:gridCol w:w="2409"/>
-        <w:gridCol w:w="2409"/>
-        <w:gridCol w:w="2409"/>
-        <w:gridCol w:w="2409"/>
+        <w:gridCol w:w="1360"/>
+        <w:gridCol w:w="2268"/>
+        <w:gridCol w:w="3742"/>
+        <w:gridCol w:w="2268"/>
       </w:tblGrid>
       <w:tr>
         <w:trPr>
@@ -803,7 +814,25 @@
         </w:trPr>
         <w:tc>
           <w:tcPr>
-            <w:tcW w:type="dxa" w:w="1701"/>
+            <w:tcW w:type="dxa" w:w="1361"/>
+          </w:tcPr>
+          <w:p>
+            <w:pPr>
+              <w:spacing w:line="276" w:lineRule="auto" w:after="60" w:before="20"/>
+            </w:pPr>
+            <w:r>
+              <w:rPr>
+                <w:rFonts w:ascii="Cambria" w:hAnsi="Cambria" w:cs="Cambria" w:eastAsia="Cambria"/>
+                <w:b/>
+                <w:sz w:val="20"/>
+              </w:rPr>
+              <w:t>Gruppe</w:t>
+            </w:r>
+          </w:p>
+        </w:tc>
+        <w:tc>
+          <w:tcPr>
+            <w:tcW w:type="dxa" w:w="2268"/>
           </w:tcPr>
           <w:p>
             <w:pPr>
@@ -821,7 +850,7 @@
         </w:tc>
         <w:tc>
           <w:tcPr>
-            <w:tcW w:type="dxa" w:w="3515"/>
+            <w:tcW w:type="dxa" w:w="3742"/>
           </w:tcPr>
           <w:p>
             <w:pPr>
@@ -839,7 +868,7 @@
         </w:tc>
         <w:tc>
           <w:tcPr>
-            <w:tcW w:type="dxa" w:w="2608"/>
+            <w:tcW w:type="dxa" w:w="2268"/>
           </w:tcPr>
           <w:p>
             <w:pPr>
@@ -855,9 +884,14 @@
             </w:r>
           </w:p>
         </w:tc>
+      </w:tr>
+      <w:tr>
+        <w:trPr>
+          <w:cantSplit/>
+        </w:trPr>
         <w:tc>
           <w:tcPr>
-            <w:tcW w:type="dxa" w:w="1814"/>
+            <w:tcW w:type="dxa" w:w="1361"/>
           </w:tcPr>
           <w:p>
             <w:pPr>
@@ -866,21 +900,15 @@
             <w:r>
               <w:rPr>
                 <w:rFonts w:ascii="Cambria" w:hAnsi="Cambria" w:cs="Cambria" w:eastAsia="Cambria"/>
-                <w:b/>
                 <w:sz w:val="20"/>
               </w:rPr>
-              <w:t>Schutzbedarf</w:t>
+              <w:t>Fundament</w:t>
             </w:r>
           </w:p>
         </w:tc>
-      </w:tr>
-      <w:tr>
-        <w:trPr>
-          <w:cantSplit/>
-        </w:trPr>
         <w:tc>
           <w:tcPr>
-            <w:tcW w:type="dxa" w:w="1701"/>
+            <w:tcW w:type="dxa" w:w="2268"/>
           </w:tcPr>
           <w:p>
             <w:pPr>
@@ -897,7 +925,7 @@
         </w:tc>
         <w:tc>
           <w:tcPr>
-            <w:tcW w:type="dxa" w:w="3515"/>
+            <w:tcW w:type="dxa" w:w="3742"/>
           </w:tcPr>
           <w:p>
             <w:pPr>
@@ -914,7 +942,7 @@
         </w:tc>
         <w:tc>
           <w:tcPr>
-            <w:tcW w:type="dxa" w:w="2608"/>
+            <w:tcW w:type="dxa" w:w="2268"/>
           </w:tcPr>
           <w:p>
             <w:pPr>
@@ -929,9 +957,14 @@
             </w:r>
           </w:p>
         </w:tc>
+      </w:tr>
+      <w:tr>
+        <w:trPr>
+          <w:cantSplit/>
+        </w:trPr>
         <w:tc>
           <w:tcPr>
-            <w:tcW w:type="dxa" w:w="1814"/>
+            <w:tcW w:type="dxa" w:w="1361"/>
           </w:tcPr>
           <w:p>
             <w:pPr>
@@ -942,7 +975,58 @@
                 <w:rFonts w:ascii="Cambria" w:hAnsi="Cambria" w:cs="Cambria" w:eastAsia="Cambria"/>
                 <w:sz w:val="20"/>
               </w:rPr>
-              <w:t>hoch</w:t>
+              <w:t>Fundament</w:t>
+            </w:r>
+          </w:p>
+        </w:tc>
+        <w:tc>
+          <w:tcPr>
+            <w:tcW w:type="dxa" w:w="2268"/>
+          </w:tcPr>
+          <w:p>
+            <w:pPr>
+              <w:spacing w:line="276" w:lineRule="auto" w:after="60" w:before="20"/>
+            </w:pPr>
+            <w:r>
+              <w:rPr>
+                <w:rFonts w:ascii="Cambria" w:hAnsi="Cambria" w:cs="Cambria" w:eastAsia="Cambria"/>
+                <w:sz w:val="20"/>
+              </w:rPr>
+              <w:t>Aufsichts-Hub</w:t>
+            </w:r>
+          </w:p>
+        </w:tc>
+        <w:tc>
+          <w:tcPr>
+            <w:tcW w:type="dxa" w:w="3742"/>
+          </w:tcPr>
+          <w:p>
+            <w:pPr>
+              <w:spacing w:line="276" w:lineRule="auto" w:after="60" w:before="20"/>
+            </w:pPr>
+            <w:r>
+              <w:rPr>
+                <w:rFonts w:ascii="Cambria" w:hAnsi="Cambria" w:cs="Cambria" w:eastAsia="Cambria"/>
+                <w:sz w:val="20"/>
+              </w:rPr>
+              <w:t>Tagesbriefing, Fristen, Logbuch, Freigabe-Inbox, Cockpit</w:t>
+            </w:r>
+          </w:p>
+        </w:tc>
+        <w:tc>
+          <w:tcPr>
+            <w:tcW w:type="dxa" w:w="2268"/>
+          </w:tcPr>
+          <w:p>
+            <w:pPr>
+              <w:spacing w:line="276" w:lineRule="auto" w:after="60" w:before="20"/>
+            </w:pPr>
+            <w:r>
+              <w:rPr>
+                <w:rFonts w:ascii="Cambria" w:hAnsi="Cambria" w:cs="Cambria" w:eastAsia="Cambria"/>
+                <w:sz w:val="20"/>
+              </w:rPr>
+              <w:t>Inhaber</w:t>
             </w:r>
           </w:p>
         </w:tc>
@@ -953,7 +1037,24 @@
         </w:trPr>
         <w:tc>
           <w:tcPr>
-            <w:tcW w:type="dxa" w:w="1701"/>
+            <w:tcW w:type="dxa" w:w="1361"/>
+          </w:tcPr>
+          <w:p>
+            <w:pPr>
+              <w:spacing w:line="276" w:lineRule="auto" w:after="60" w:before="20"/>
+            </w:pPr>
+            <w:r>
+              <w:rPr>
+                <w:rFonts w:ascii="Cambria" w:hAnsi="Cambria" w:cs="Cambria" w:eastAsia="Cambria"/>
+                <w:sz w:val="20"/>
+              </w:rPr>
+              <w:t>Facharbeit</w:t>
+            </w:r>
+          </w:p>
+        </w:tc>
+        <w:tc>
+          <w:tcPr>
+            <w:tcW w:type="dxa" w:w="2268"/>
           </w:tcPr>
           <w:p>
             <w:pPr>
@@ -970,7 +1071,7 @@
         </w:tc>
         <w:tc>
           <w:tcPr>
-            <w:tcW w:type="dxa" w:w="3515"/>
+            <w:tcW w:type="dxa" w:w="3742"/>
           </w:tcPr>
           <w:p>
             <w:pPr>
@@ -987,7 +1088,7 @@
         </w:tc>
         <w:tc>
           <w:tcPr>
-            <w:tcW w:type="dxa" w:w="2608"/>
+            <w:tcW w:type="dxa" w:w="2268"/>
           </w:tcPr>
           <w:p>
             <w:pPr>
@@ -1002,9 +1103,14 @@
             </w:r>
           </w:p>
         </w:tc>
+      </w:tr>
+      <w:tr>
+        <w:trPr>
+          <w:cantSplit/>
+        </w:trPr>
         <w:tc>
           <w:tcPr>
-            <w:tcW w:type="dxa" w:w="1814"/>
+            <w:tcW w:type="dxa" w:w="1361"/>
           </w:tcPr>
           <w:p>
             <w:pPr>
@@ -1015,18 +1121,13 @@
                 <w:rFonts w:ascii="Cambria" w:hAnsi="Cambria" w:cs="Cambria" w:eastAsia="Cambria"/>
                 <w:sz w:val="20"/>
               </w:rPr>
-              <w:t>mittel, Lizenzen beachten</w:t>
+              <w:t>Facharbeit</w:t>
             </w:r>
           </w:p>
         </w:tc>
-      </w:tr>
-      <w:tr>
-        <w:trPr>
-          <w:cantSplit/>
-        </w:trPr>
         <w:tc>
           <w:tcPr>
-            <w:tcW w:type="dxa" w:w="1701"/>
+            <w:tcW w:type="dxa" w:w="2268"/>
           </w:tcPr>
           <w:p>
             <w:pPr>
@@ -1043,7 +1144,7 @@
         </w:tc>
         <w:tc>
           <w:tcPr>
-            <w:tcW w:type="dxa" w:w="3515"/>
+            <w:tcW w:type="dxa" w:w="3742"/>
           </w:tcPr>
           <w:p>
             <w:pPr>
@@ -1054,13 +1155,13 @@
                 <w:rFonts w:ascii="Cambria" w:hAnsi="Cambria" w:cs="Cambria" w:eastAsia="Cambria"/>
                 <w:sz w:val="20"/>
               </w:rPr>
-              <w:t>Machbarkeit, Volumen, Bewertung, Ankauf, Energie, Wettbewerb</w:t>
+              <w:t>Machbarkeit, Volumen, Bewertung, Ankauf, Energie</w:t>
             </w:r>
           </w:p>
         </w:tc>
         <w:tc>
           <w:tcPr>
-            <w:tcW w:type="dxa" w:w="2608"/>
+            <w:tcW w:type="dxa" w:w="2268"/>
           </w:tcPr>
           <w:p>
             <w:pPr>
@@ -1075,9 +1176,14 @@
             </w:r>
           </w:p>
         </w:tc>
+      </w:tr>
+      <w:tr>
+        <w:trPr>
+          <w:cantSplit/>
+        </w:trPr>
         <w:tc>
           <w:tcPr>
-            <w:tcW w:type="dxa" w:w="1814"/>
+            <w:tcW w:type="dxa" w:w="1361"/>
           </w:tcPr>
           <w:p>
             <w:pPr>
@@ -1088,18 +1194,13 @@
                 <w:rFonts w:ascii="Cambria" w:hAnsi="Cambria" w:cs="Cambria" w:eastAsia="Cambria"/>
                 <w:sz w:val="20"/>
               </w:rPr>
-              <w:t>hoch, je Auftrag</w:t>
+              <w:t>Facharbeit</w:t>
             </w:r>
           </w:p>
         </w:tc>
-      </w:tr>
-      <w:tr>
-        <w:trPr>
-          <w:cantSplit/>
-        </w:trPr>
         <w:tc>
           <w:tcPr>
-            <w:tcW w:type="dxa" w:w="1701"/>
+            <w:tcW w:type="dxa" w:w="2268"/>
           </w:tcPr>
           <w:p>
             <w:pPr>
@@ -1116,7 +1217,7 @@
         </w:tc>
         <w:tc>
           <w:tcPr>
-            <w:tcW w:type="dxa" w:w="3515"/>
+            <w:tcW w:type="dxa" w:w="3742"/>
           </w:tcPr>
           <w:p>
             <w:pPr>
@@ -1133,7 +1234,7 @@
         </w:tc>
         <w:tc>
           <w:tcPr>
-            <w:tcW w:type="dxa" w:w="2608"/>
+            <w:tcW w:type="dxa" w:w="2268"/>
           </w:tcPr>
           <w:p>
             <w:pPr>
@@ -1144,13 +1245,18 @@
                 <w:rFonts w:ascii="Cambria" w:hAnsi="Cambria" w:cs="Cambria" w:eastAsia="Cambria"/>
                 <w:sz w:val="20"/>
               </w:rPr>
-              <w:t>Inhaber, Mitarbeitende, Partner</w:t>
+              <w:t>Inhaber, Mitarbeitende je Projekt</w:t>
             </w:r>
           </w:p>
         </w:tc>
+      </w:tr>
+      <w:tr>
+        <w:trPr>
+          <w:cantSplit/>
+        </w:trPr>
         <w:tc>
           <w:tcPr>
-            <w:tcW w:type="dxa" w:w="1814"/>
+            <w:tcW w:type="dxa" w:w="1361"/>
           </w:tcPr>
           <w:p>
             <w:pPr>
@@ -1161,18 +1267,13 @@
                 <w:rFonts w:ascii="Cambria" w:hAnsi="Cambria" w:cs="Cambria" w:eastAsia="Cambria"/>
                 <w:sz w:val="20"/>
               </w:rPr>
-              <w:t>hoch, je Projekt und Mandant</w:t>
+              <w:t>Facharbeit</w:t>
             </w:r>
           </w:p>
         </w:tc>
-      </w:tr>
-      <w:tr>
-        <w:trPr>
-          <w:cantSplit/>
-        </w:trPr>
         <w:tc>
           <w:tcPr>
-            <w:tcW w:type="dxa" w:w="1701"/>
+            <w:tcW w:type="dxa" w:w="2268"/>
           </w:tcPr>
           <w:p>
             <w:pPr>
@@ -1183,13 +1284,13 @@
                 <w:rFonts w:ascii="Cambria" w:hAnsi="Cambria" w:cs="Cambria" w:eastAsia="Cambria"/>
                 <w:sz w:val="20"/>
               </w:rPr>
-              <w:t>Office-Hub</w:t>
+              <w:t>Wettbewerbs-Hub</w:t>
             </w:r>
           </w:p>
         </w:tc>
         <w:tc>
           <w:tcPr>
-            <w:tcW w:type="dxa" w:w="3515"/>
+            <w:tcW w:type="dxa" w:w="3742"/>
           </w:tcPr>
           <w:p>
             <w:pPr>
@@ -1200,86 +1301,13 @@
                 <w:rFonts w:ascii="Cambria" w:hAnsi="Cambria" w:cs="Cambria" w:eastAsia="Cambria"/>
                 <w:sz w:val="20"/>
               </w:rPr>
-              <w:t>Korrespondenz, Fristen, bexio, Mahnwesen, zwei Rechtsträger</w:t>
+              <w:t>Programm, Flächennachweis, Konformität, Bericht, Plakat</w:t>
             </w:r>
           </w:p>
         </w:tc>
         <w:tc>
           <w:tcPr>
-            <w:tcW w:type="dxa" w:w="2608"/>
-          </w:tcPr>
-          <w:p>
-            <w:pPr>
-              <w:spacing w:line="276" w:lineRule="auto" w:after="60" w:before="20"/>
-            </w:pPr>
-            <w:r>
-              <w:rPr>
-                <w:rFonts w:ascii="Cambria" w:hAnsi="Cambria" w:cs="Cambria" w:eastAsia="Cambria"/>
-                <w:sz w:val="20"/>
-              </w:rPr>
-              <w:t>Inhaber</w:t>
-            </w:r>
-          </w:p>
-        </w:tc>
-        <w:tc>
-          <w:tcPr>
-            <w:tcW w:type="dxa" w:w="1814"/>
-          </w:tcPr>
-          <w:p>
-            <w:pPr>
-              <w:spacing w:line="276" w:lineRule="auto" w:after="60" w:before="20"/>
-            </w:pPr>
-            <w:r>
-              <w:rPr>
-                <w:rFonts w:ascii="Cambria" w:hAnsi="Cambria" w:cs="Cambria" w:eastAsia="Cambria"/>
-                <w:sz w:val="20"/>
-              </w:rPr>
-              <w:t>sehr hoch</w:t>
-            </w:r>
-          </w:p>
-        </w:tc>
-      </w:tr>
-      <w:tr>
-        <w:trPr>
-          <w:cantSplit/>
-        </w:trPr>
-        <w:tc>
-          <w:tcPr>
-            <w:tcW w:type="dxa" w:w="1701"/>
-          </w:tcPr>
-          <w:p>
-            <w:pPr>
-              <w:spacing w:line="276" w:lineRule="auto" w:after="60" w:before="20"/>
-            </w:pPr>
-            <w:r>
-              <w:rPr>
-                <w:rFonts w:ascii="Cambria" w:hAnsi="Cambria" w:cs="Cambria" w:eastAsia="Cambria"/>
-                <w:sz w:val="20"/>
-              </w:rPr>
-              <w:t>Akquise-Hub</w:t>
-            </w:r>
-          </w:p>
-        </w:tc>
-        <w:tc>
-          <w:tcPr>
-            <w:tcW w:type="dxa" w:w="3515"/>
-          </w:tcPr>
-          <w:p>
-            <w:pPr>
-              <w:spacing w:line="276" w:lineRule="auto" w:after="60" w:before="20"/>
-            </w:pPr>
-            <w:r>
-              <w:rPr>
-                <w:rFonts w:ascii="Cambria" w:hAnsi="Cambria" w:cs="Cambria" w:eastAsia="Cambria"/>
-                <w:sz w:val="20"/>
-              </w:rPr>
-              <w:t>Website, LinkedIn, Telesales, Leads, Demo-Studio</w:t>
-            </w:r>
-          </w:p>
-        </w:tc>
-        <w:tc>
-          <w:tcPr>
-            <w:tcW w:type="dxa" w:w="2608"/>
+            <w:tcW w:type="dxa" w:w="2268"/>
           </w:tcPr>
           <w:p>
             <w:pPr>
@@ -1294,9 +1322,14 @@
             </w:r>
           </w:p>
         </w:tc>
+      </w:tr>
+      <w:tr>
+        <w:trPr>
+          <w:cantSplit/>
+        </w:trPr>
         <w:tc>
           <w:tcPr>
-            <w:tcW w:type="dxa" w:w="1814"/>
+            <w:tcW w:type="dxa" w:w="1361"/>
           </w:tcPr>
           <w:p>
             <w:pPr>
@@ -1307,7 +1340,58 @@
                 <w:rFonts w:ascii="Cambria" w:hAnsi="Cambria" w:cs="Cambria" w:eastAsia="Cambria"/>
                 <w:sz w:val="20"/>
               </w:rPr>
-              <w:t>mittel</w:t>
+              <w:t>Geschäft</w:t>
+            </w:r>
+          </w:p>
+        </w:tc>
+        <w:tc>
+          <w:tcPr>
+            <w:tcW w:type="dxa" w:w="2268"/>
+          </w:tcPr>
+          <w:p>
+            <w:pPr>
+              <w:spacing w:line="276" w:lineRule="auto" w:after="60" w:before="20"/>
+            </w:pPr>
+            <w:r>
+              <w:rPr>
+                <w:rFonts w:ascii="Cambria" w:hAnsi="Cambria" w:cs="Cambria" w:eastAsia="Cambria"/>
+                <w:sz w:val="20"/>
+              </w:rPr>
+              <w:t>Finanz-Hub</w:t>
+            </w:r>
+          </w:p>
+        </w:tc>
+        <w:tc>
+          <w:tcPr>
+            <w:tcW w:type="dxa" w:w="3742"/>
+          </w:tcPr>
+          <w:p>
+            <w:pPr>
+              <w:spacing w:line="276" w:lineRule="auto" w:after="60" w:before="20"/>
+            </w:pPr>
+            <w:r>
+              <w:rPr>
+                <w:rFonts w:ascii="Cambria" w:hAnsi="Cambria" w:cs="Cambria" w:eastAsia="Cambria"/>
+                <w:sz w:val="20"/>
+              </w:rPr>
+              <w:t>bexio, Mahnwesen, Zahlungsabgleich, zwei Rechtsträger</w:t>
+            </w:r>
+          </w:p>
+        </w:tc>
+        <w:tc>
+          <w:tcPr>
+            <w:tcW w:type="dxa" w:w="2268"/>
+          </w:tcPr>
+          <w:p>
+            <w:pPr>
+              <w:spacing w:line="276" w:lineRule="auto" w:after="60" w:before="20"/>
+            </w:pPr>
+            <w:r>
+              <w:rPr>
+                <w:rFonts w:ascii="Cambria" w:hAnsi="Cambria" w:cs="Cambria" w:eastAsia="Cambria"/>
+                <w:sz w:val="20"/>
+              </w:rPr>
+              <w:t>Inhaber, Treuhand lesend</w:t>
             </w:r>
           </w:p>
         </w:tc>
@@ -1318,7 +1402,97 @@
         </w:trPr>
         <w:tc>
           <w:tcPr>
-            <w:tcW w:type="dxa" w:w="1701"/>
+            <w:tcW w:type="dxa" w:w="1361"/>
+          </w:tcPr>
+          <w:p>
+            <w:pPr>
+              <w:spacing w:line="276" w:lineRule="auto" w:after="60" w:before="20"/>
+            </w:pPr>
+            <w:r>
+              <w:rPr>
+                <w:rFonts w:ascii="Cambria" w:hAnsi="Cambria" w:cs="Cambria" w:eastAsia="Cambria"/>
+                <w:sz w:val="20"/>
+              </w:rPr>
+              <w:t>Geschäft</w:t>
+            </w:r>
+          </w:p>
+        </w:tc>
+        <w:tc>
+          <w:tcPr>
+            <w:tcW w:type="dxa" w:w="2268"/>
+          </w:tcPr>
+          <w:p>
+            <w:pPr>
+              <w:spacing w:line="276" w:lineRule="auto" w:after="60" w:before="20"/>
+            </w:pPr>
+            <w:r>
+              <w:rPr>
+                <w:rFonts w:ascii="Cambria" w:hAnsi="Cambria" w:cs="Cambria" w:eastAsia="Cambria"/>
+                <w:sz w:val="20"/>
+              </w:rPr>
+              <w:t>Akquise- und Stimm-Hub</w:t>
+            </w:r>
+          </w:p>
+        </w:tc>
+        <w:tc>
+          <w:tcPr>
+            <w:tcW w:type="dxa" w:w="3742"/>
+          </w:tcPr>
+          <w:p>
+            <w:pPr>
+              <w:spacing w:line="276" w:lineRule="auto" w:after="60" w:before="20"/>
+            </w:pPr>
+            <w:r>
+              <w:rPr>
+                <w:rFonts w:ascii="Cambria" w:hAnsi="Cambria" w:cs="Cambria" w:eastAsia="Cambria"/>
+                <w:sz w:val="20"/>
+              </w:rPr>
+              <w:t>Stilmodell als Dienst, Website, LinkedIn, Leads</w:t>
+            </w:r>
+          </w:p>
+        </w:tc>
+        <w:tc>
+          <w:tcPr>
+            <w:tcW w:type="dxa" w:w="2268"/>
+          </w:tcPr>
+          <w:p>
+            <w:pPr>
+              <w:spacing w:line="276" w:lineRule="auto" w:after="60" w:before="20"/>
+            </w:pPr>
+            <w:r>
+              <w:rPr>
+                <w:rFonts w:ascii="Cambria" w:hAnsi="Cambria" w:cs="Cambria" w:eastAsia="Cambria"/>
+                <w:sz w:val="20"/>
+              </w:rPr>
+              <w:t>Inhaber, Mitarbeitende ohne Korpus</w:t>
+            </w:r>
+          </w:p>
+        </w:tc>
+      </w:tr>
+      <w:tr>
+        <w:trPr>
+          <w:cantSplit/>
+        </w:trPr>
+        <w:tc>
+          <w:tcPr>
+            <w:tcW w:type="dxa" w:w="1361"/>
+          </w:tcPr>
+          <w:p>
+            <w:pPr>
+              <w:spacing w:line="276" w:lineRule="auto" w:after="60" w:before="20"/>
+            </w:pPr>
+            <w:r>
+              <w:rPr>
+                <w:rFonts w:ascii="Cambria" w:hAnsi="Cambria" w:cs="Cambria" w:eastAsia="Cambria"/>
+                <w:sz w:val="20"/>
+              </w:rPr>
+              <w:t>Geschäft</w:t>
+            </w:r>
+          </w:p>
+        </w:tc>
+        <w:tc>
+          <w:tcPr>
+            <w:tcW w:type="dxa" w:w="2268"/>
           </w:tcPr>
           <w:p>
             <w:pPr>
@@ -1335,7 +1509,7 @@
         </w:tc>
         <w:tc>
           <w:tcPr>
-            <w:tcW w:type="dxa" w:w="3515"/>
+            <w:tcW w:type="dxa" w:w="3742"/>
           </w:tcPr>
           <w:p>
             <w:pPr>
@@ -1352,7 +1526,7 @@
         </w:tc>
         <w:tc>
           <w:tcPr>
-            <w:tcW w:type="dxa" w:w="2608"/>
+            <w:tcW w:type="dxa" w:w="2268"/>
           </w:tcPr>
           <w:p>
             <w:pPr>
@@ -1367,23 +1541,6 @@
             </w:r>
           </w:p>
         </w:tc>
-        <w:tc>
-          <w:tcPr>
-            <w:tcW w:type="dxa" w:w="1814"/>
-          </w:tcPr>
-          <w:p>
-            <w:pPr>
-              <w:spacing w:line="276" w:lineRule="auto" w:after="60" w:before="20"/>
-            </w:pPr>
-            <w:r>
-              <w:rPr>
-                <w:rFonts w:ascii="Cambria" w:hAnsi="Cambria" w:cs="Cambria" w:eastAsia="Cambria"/>
-                <w:sz w:val="20"/>
-              </w:rPr>
-              <w:t>hoch, Hosting CH oder EU</w:t>
-            </w:r>
-          </w:p>
-        </w:tc>
       </w:tr>
     </w:tbl>
     <w:p>
@@ -1391,12 +1548,34 @@
         <w:rPr>
           <w:b/>
         </w:rPr>
-        <w:t>04.3 Die Schichten des Plattform-Hub.</w:t>
+        <w:t>04.4 Zwei Hubs mit Sonderstatus.</w:t>
+      </w:r>
+      <w:r>
+        <w:t xml:space="preserve"> Der Aufsichts-Hub liest täglich fremde Inhalte und handelt nach aussen. Er ist der risikoreichste Hub, wird zuerst migriert und erhält die Trennung von Leser und Handelndem zuerst. Der Projekt-Hub trägt die laufenden Bauprojekte mit Fristen. Er darf im Umbau nie stehen und wird zuletzt angefasst.</w:t>
+      </w:r>
+    </w:p>
+    <w:p>
+      <w:r>
+        <w:rPr>
+          <w:b/>
+        </w:rPr>
+        <w:t>04.5 Datenklassen.</w:t>
+      </w:r>
+      <w:r>
+        <w:t xml:space="preserve"> K1 öffentlich, K2 intern, K3 vertraulich (Projekt, Kunde), K4 Personen- und Finanzdaten, dazu die Achse «lizenzgebunden» für Normen- und Buchdestillate, die nie extern gespiegelt werden. Je Klasse ist festzulegen, was in den KI-Kontext, in Git und in die Cloud darf. Die zwei Rechtsträger sind Mandanten im Projekt- und im Finanz-Hub, keine eigenen Hubs. Das Mandantenfeld gehört ab dem ersten Datenbankschema ins Datenmodell.</w:t>
+      </w:r>
+    </w:p>
+    <w:p>
+      <w:r>
+        <w:rPr>
+          <w:b/>
+        </w:rPr>
+        <w:t>04.6 Die Schichten des Plattform-Hub.</w:t>
       </w:r>
     </w:p>
     <w:tbl>
       <w:tblPr>
-        <w:tblW w:type="auto" w:w="0"/>
+        <w:tblW w:type="dxa" w:w="9639"/>
         <w:tblLayout w:type="fixed"/>
         <w:tblLook w:firstColumn="1" w:firstRow="1" w:lastColumn="0" w:lastRow="0" w:noHBand="0" w:noVBand="1" w:val="04A0"/>
         <w:tblBorders>
@@ -1409,9 +1588,9 @@
         </w:tblBorders>
       </w:tblPr>
       <w:tblGrid>
-        <w:gridCol w:w="3213"/>
-        <w:gridCol w:w="3213"/>
-        <w:gridCol w:w="3213"/>
+        <w:gridCol w:w="2381"/>
+        <w:gridCol w:w="4082"/>
+        <w:gridCol w:w="3175"/>
       </w:tblGrid>
       <w:tr>
         <w:trPr>
@@ -1419,7 +1598,7 @@
         </w:trPr>
         <w:tc>
           <w:tcPr>
-            <w:tcW w:type="dxa" w:w="2154"/>
+            <w:tcW w:type="dxa" w:w="2381"/>
           </w:tcPr>
           <w:p>
             <w:pPr>
@@ -1455,7 +1634,7 @@
         </w:tc>
         <w:tc>
           <w:tcPr>
-            <w:tcW w:type="dxa" w:w="3402"/>
+            <w:tcW w:type="dxa" w:w="3175"/>
           </w:tcPr>
           <w:p>
             <w:pPr>
@@ -1478,7 +1657,7 @@
         </w:trPr>
         <w:tc>
           <w:tcPr>
-            <w:tcW w:type="dxa" w:w="2154"/>
+            <w:tcW w:type="dxa" w:w="2381"/>
           </w:tcPr>
           <w:p>
             <w:pPr>
@@ -1506,13 +1685,13 @@
                 <w:rFonts w:ascii="Cambria" w:hAnsi="Cambria" w:cs="Cambria" w:eastAsia="Cambria"/>
                 <w:sz w:val="20"/>
               </w:rPr>
-              <w:t>ein Konto je Person, MFA, Geräteverwaltung, Rollen, Mandanten</w:t>
+              <w:t>ein Konto je Person, MFA, schlanke Geräteverwaltung, Rollen</w:t>
             </w:r>
           </w:p>
         </w:tc>
         <w:tc>
           <w:tcPr>
-            <w:tcW w:type="dxa" w:w="3402"/>
+            <w:tcW w:type="dxa" w:w="3175"/>
           </w:tcPr>
           <w:p>
             <w:pPr>
@@ -1534,7 +1713,7 @@
         </w:trPr>
         <w:tc>
           <w:tcPr>
-            <w:tcW w:type="dxa" w:w="2154"/>
+            <w:tcW w:type="dxa" w:w="2381"/>
           </w:tcPr>
           <w:p>
             <w:pPr>
@@ -1568,7 +1747,7 @@
         </w:tc>
         <w:tc>
           <w:tcPr>
-            <w:tcW w:type="dxa" w:w="3402"/>
+            <w:tcW w:type="dxa" w:w="3175"/>
           </w:tcPr>
           <w:p>
             <w:pPr>
@@ -1590,7 +1769,7 @@
         </w:trPr>
         <w:tc>
           <w:tcPr>
-            <w:tcW w:type="dxa" w:w="2154"/>
+            <w:tcW w:type="dxa" w:w="2381"/>
           </w:tcPr>
           <w:p>
             <w:pPr>
@@ -1618,13 +1797,13 @@
                 <w:rFonts w:ascii="Cambria" w:hAnsi="Cambria" w:cs="Cambria" w:eastAsia="Cambria"/>
                 <w:sz w:val="20"/>
               </w:rPr>
-              <w:t>definierte Umgebung, Berechtigungsprofil je Jobklasse, Sandbox</w:t>
+              <w:t>definierte Umgebung, Profil je Jobklasse, Sandbox</w:t>
             </w:r>
           </w:p>
         </w:tc>
         <w:tc>
           <w:tcPr>
-            <w:tcW w:type="dxa" w:w="3402"/>
+            <w:tcW w:type="dxa" w:w="3175"/>
           </w:tcPr>
           <w:p>
             <w:pPr>
@@ -1635,7 +1814,7 @@
                 <w:rFonts w:ascii="Cambria" w:hAnsi="Cambria" w:cs="Cambria" w:eastAsia="Cambria"/>
                 <w:sz w:val="20"/>
               </w:rPr>
-              <w:t>Bash(*) ohne Deny-Liste, Schutz per Prompt</w:t>
+              <w:t>pauschales Shell-Recht, Schutz per Prompt</w:t>
             </w:r>
           </w:p>
         </w:tc>
@@ -1646,7 +1825,7 @@
         </w:trPr>
         <w:tc>
           <w:tcPr>
-            <w:tcW w:type="dxa" w:w="2154"/>
+            <w:tcW w:type="dxa" w:w="2381"/>
           </w:tcPr>
           <w:p>
             <w:pPr>
@@ -1680,7 +1859,7 @@
         </w:tc>
         <w:tc>
           <w:tcPr>
-            <w:tcW w:type="dxa" w:w="3402"/>
+            <w:tcW w:type="dxa" w:w="3175"/>
           </w:tcPr>
           <w:p>
             <w:pPr>
@@ -1702,63 +1881,7 @@
         </w:trPr>
         <w:tc>
           <w:tcPr>
-            <w:tcW w:type="dxa" w:w="2154"/>
-          </w:tcPr>
-          <w:p>
-            <w:pPr>
-              <w:spacing w:line="276" w:lineRule="auto" w:after="60" w:before="20"/>
-            </w:pPr>
-            <w:r>
-              <w:rPr>
-                <w:rFonts w:ascii="Cambria" w:hAnsi="Cambria" w:cs="Cambria" w:eastAsia="Cambria"/>
-                <w:sz w:val="20"/>
-              </w:rPr>
-              <w:t>Wissensdienst</w:t>
-            </w:r>
-          </w:p>
-        </w:tc>
-        <w:tc>
-          <w:tcPr>
-            <w:tcW w:type="dxa" w:w="4082"/>
-          </w:tcPr>
-          <w:p>
-            <w:pPr>
-              <w:spacing w:line="276" w:lineRule="auto" w:after="60" w:before="20"/>
-            </w:pPr>
-            <w:r>
-              <w:rPr>
-                <w:rFonts w:ascii="Cambria" w:hAnsi="Cambria" w:cs="Cambria" w:eastAsia="Cambria"/>
-                <w:sz w:val="20"/>
-              </w:rPr>
-              <w:t>Volltext- und Vektorsuche über alle Wissensbasen, Provenienz</w:t>
-            </w:r>
-          </w:p>
-        </w:tc>
-        <w:tc>
-          <w:tcPr>
-            <w:tcW w:type="dxa" w:w="3402"/>
-          </w:tcPr>
-          <w:p>
-            <w:pPr>
-              <w:spacing w:line="276" w:lineRule="auto" w:after="60" w:before="20"/>
-            </w:pPr>
-            <w:r>
-              <w:rPr>
-                <w:rFonts w:ascii="Cambria" w:hAnsi="Cambria" w:cs="Cambria" w:eastAsia="Cambria"/>
-                <w:sz w:val="20"/>
-              </w:rPr>
-              <w:t>grep über Dateien, Register bis 1 MB</w:t>
-            </w:r>
-          </w:p>
-        </w:tc>
-      </w:tr>
-      <w:tr>
-        <w:trPr>
-          <w:cantSplit/>
-        </w:trPr>
-        <w:tc>
-          <w:tcPr>
-            <w:tcW w:type="dxa" w:w="2154"/>
+            <w:tcW w:type="dxa" w:w="2381"/>
           </w:tcPr>
           <w:p>
             <w:pPr>
@@ -1786,13 +1909,13 @@
                 <w:rFonts w:ascii="Cambria" w:hAnsi="Cambria" w:cs="Cambria" w:eastAsia="Cambria"/>
                 <w:sz w:val="20"/>
               </w:rPr>
-              <w:t>typisierte MCP-Server je Domäne, gemeinsames Connector-SDK, Secrets-Speicher</w:t>
+              <w:t>Secrets-Speicher, geprüfte Connectoren, später typisierte MCP-Server</w:t>
             </w:r>
           </w:p>
         </w:tc>
         <w:tc>
           <w:tcPr>
-            <w:tcW w:type="dxa" w:w="3402"/>
+            <w:tcW w:type="dxa" w:w="3175"/>
           </w:tcPr>
           <w:p>
             <w:pPr>
@@ -1814,7 +1937,7 @@
         </w:trPr>
         <w:tc>
           <w:tcPr>
-            <w:tcW w:type="dxa" w:w="2154"/>
+            <w:tcW w:type="dxa" w:w="2381"/>
           </w:tcPr>
           <w:p>
             <w:pPr>
@@ -1848,7 +1971,7 @@
         </w:tc>
         <w:tc>
           <w:tcPr>
-            <w:tcW w:type="dxa" w:w="3402"/>
+            <w:tcW w:type="dxa" w:w="3175"/>
           </w:tcPr>
           <w:p>
             <w:pPr>
@@ -1870,7 +1993,7 @@
         </w:trPr>
         <w:tc>
           <w:tcPr>
-            <w:tcW w:type="dxa" w:w="2154"/>
+            <w:tcW w:type="dxa" w:w="2381"/>
           </w:tcPr>
           <w:p>
             <w:pPr>
@@ -1904,7 +2027,7 @@
         </w:tc>
         <w:tc>
           <w:tcPr>
-            <w:tcW w:type="dxa" w:w="3402"/>
+            <w:tcW w:type="dxa" w:w="3175"/>
           </w:tcPr>
           <w:p>
             <w:pPr>
@@ -1926,7 +2049,7 @@
         </w:trPr>
         <w:tc>
           <w:tcPr>
-            <w:tcW w:type="dxa" w:w="2154"/>
+            <w:tcW w:type="dxa" w:w="2381"/>
           </w:tcPr>
           <w:p>
             <w:pPr>
@@ -1960,7 +2083,7 @@
         </w:tc>
         <w:tc>
           <w:tcPr>
-            <w:tcW w:type="dxa" w:w="3402"/>
+            <w:tcW w:type="dxa" w:w="3175"/>
           </w:tcPr>
           <w:p>
             <w:pPr>
@@ -1982,7 +2105,7 @@
         </w:trPr>
         <w:tc>
           <w:tcPr>
-            <w:tcW w:type="dxa" w:w="2154"/>
+            <w:tcW w:type="dxa" w:w="2381"/>
           </w:tcPr>
           <w:p>
             <w:pPr>
@@ -2016,7 +2139,7 @@
         </w:tc>
         <w:tc>
           <w:tcPr>
-            <w:tcW w:type="dxa" w:w="3402"/>
+            <w:tcW w:type="dxa" w:w="3175"/>
           </w:tcPr>
           <w:p>
             <w:pPr>
@@ -2032,16 +2155,72 @@
           </w:p>
         </w:tc>
       </w:tr>
+      <w:tr>
+        <w:trPr>
+          <w:cantSplit/>
+        </w:trPr>
+        <w:tc>
+          <w:tcPr>
+            <w:tcW w:type="dxa" w:w="2381"/>
+          </w:tcPr>
+          <w:p>
+            <w:pPr>
+              <w:spacing w:line="276" w:lineRule="auto" w:after="60" w:before="20"/>
+            </w:pPr>
+            <w:r>
+              <w:rPr>
+                <w:rFonts w:ascii="Cambria" w:hAnsi="Cambria" w:cs="Cambria" w:eastAsia="Cambria"/>
+                <w:sz w:val="20"/>
+              </w:rPr>
+              <w:t>Wissensdienst (Ausbau)</w:t>
+            </w:r>
+          </w:p>
+        </w:tc>
+        <w:tc>
+          <w:tcPr>
+            <w:tcW w:type="dxa" w:w="4082"/>
+          </w:tcPr>
+          <w:p>
+            <w:pPr>
+              <w:spacing w:line="276" w:lineRule="auto" w:after="60" w:before="20"/>
+            </w:pPr>
+            <w:r>
+              <w:rPr>
+                <w:rFonts w:ascii="Cambria" w:hAnsi="Cambria" w:cs="Cambria" w:eastAsia="Cambria"/>
+                <w:sz w:val="20"/>
+              </w:rPr>
+              <w:t>Volltext- und Vektorsuche über alle Wissensbasen</w:t>
+            </w:r>
+          </w:p>
+        </w:tc>
+        <w:tc>
+          <w:tcPr>
+            <w:tcW w:type="dxa" w:w="3175"/>
+          </w:tcPr>
+          <w:p>
+            <w:pPr>
+              <w:spacing w:line="276" w:lineRule="auto" w:after="60" w:before="20"/>
+            </w:pPr>
+            <w:r>
+              <w:rPr>
+                <w:rFonts w:ascii="Cambria" w:hAnsi="Cambria" w:cs="Cambria" w:eastAsia="Cambria"/>
+                <w:sz w:val="20"/>
+              </w:rPr>
+              <w:t>grep über Dateien, Register bis 1 MB</w:t>
+            </w:r>
+          </w:p>
+        </w:tc>
+      </w:tr>
     </w:tbl>
     <w:p>
       <w:r>
         <w:rPr>
           <w:b/>
         </w:rPr>
-        <w:t>04.4 Das Zielbild ist ein Vorschlag.</w:t>
+        <w:t>04.7 Das Zielbild ist ein Vorschlag.</w:t>
       </w:r>
       <w:r>
-        <w:t xml:space="preserve"> Hub-Schnitt und Schichten sind die Sicht des Auftraggebers. AP0 bestätigt oder korrigiert sie.</w:t>
+        <w:t xml:space="preserve"> Hub-Schnitt, Zonen und Schichten sind die Sicht des Auftraggebers. AP0 bestätigt oder korrigiert sie.</w:t>
       </w:r>
     </w:p>
     <w:p>
@@ -2068,10 +2247,10 @@
         <w:rPr>
           <w:b/>
         </w:rPr>
-        <w:t>05.2 Standard vor Eigenbau.</w:t>
+        <w:t>05.2 Kleiner Kern.</w:t>
       </w:r>
       <w:r>
-        <w:t xml:space="preserve"> Wo ein erprobtes Werkzeug eine Eigenbau-Schicht ersetzt, gewinnt das Werkzeug.</w:t>
+        <w:t xml:space="preserve"> Ein Host, eine Datenbank, wenige gemanagte Dienste. Die Zahl der selbst betriebenen Dienste ist ein Abnahmekriterium. Je Schicht ein Architekturentscheid mit Alternative und Ausstiegsweg.</w:t>
       </w:r>
     </w:p>
     <w:p>
@@ -2079,10 +2258,10 @@
         <w:rPr>
           <w:b/>
         </w:rPr>
-        <w:t>05.3 KI-bedienbar, aber geführt.</w:t>
+        <w:t>05.3 Standard vor Eigenbau, gemanagt vor selbst betrieben,</w:t>
       </w:r>
       <w:r>
-        <w:t xml:space="preserve"> Alles ist per CLI, API oder Infrastructure as Code bedienbar, damit die KI weiterarbeiten kann. Änderungen an der Plattform laufen über Review und CI.</w:t>
+        <w:t xml:space="preserve"> wo ein Dienst mit Standort Schweiz oder EU genügt.</w:t>
       </w:r>
     </w:p>
     <w:p>
@@ -2090,10 +2269,10 @@
         <w:rPr>
           <w:b/>
         </w:rPr>
-        <w:t>05.4 Minimaler Eigenbetrieb.</w:t>
+        <w:t>05.4 Risiko zuerst.</w:t>
       </w:r>
       <w:r>
-        <w:t xml:space="preserve"> Der Inhaber ist Architekt, nicht Administrator. Gesucht ist eine Lösung mit Wartungsvertrag, nicht ein zweiter Beruf.</w:t>
+        <w:t xml:space="preserve"> Backup, Alarm, Schlüssel und Geräte kommen vor dem Umbau von Daten und Laufzeit. Sofortmassnahmen sind additiv und einzeln abschaltbar.</w:t>
       </w:r>
     </w:p>
     <w:p>
@@ -2101,10 +2280,10 @@
         <w:rPr>
           <w:b/>
         </w:rPr>
-        <w:t>05.5 Datenhoheit.</w:t>
+        <w:t>05.5 KI-bedienbar, aber geführt.</w:t>
       </w:r>
       <w:r>
-        <w:t xml:space="preserve"> Schweizer DSG, Datenstandort Schweiz oder EU bevorzugt, Kundschaft im Spitalumfeld.</w:t>
+        <w:t xml:space="preserve"> Alles ist per CLI, API oder Infrastructure as Code bedienbar, damit die KI weiterarbeiten kann. Änderungen an Plattform, Policy und Profilen laufen über Review und CI, auch für Bots.</w:t>
       </w:r>
     </w:p>
     <w:p>
@@ -2112,10 +2291,10 @@
         <w:rPr>
           <w:b/>
         </w:rPr>
-        <w:t>05.6 macOS bleibt.</w:t>
+        <w:t>05.6 Minimaler Eigenbetrieb.</w:t>
       </w:r>
       <w:r>
-        <w:t xml:space="preserve"> Mail-Versand, ArchiCAD, Cinema 4D, InDesign und Rhino sind an Macs gebunden. Die Macs bleiben Arbeitsplätze, einer davon dient als Mac-Worker der Plattform.</w:t>
+        <w:t xml:space="preserve"> Der Inhaber ist Architekt, nicht Administrator. Gesucht ist eine Lösung mit Wartungsvertrag, nicht ein zweiter Beruf. Sein Zeitbudget je Woche ist Teil der Planung.</w:t>
       </w:r>
     </w:p>
     <w:p>
@@ -2123,7 +2302,29 @@
         <w:rPr>
           <w:b/>
         </w:rPr>
-        <w:t>05.7 Microsoft 365 und bexio bleiben.</w:t>
+        <w:t>05.7 Datenhoheit.</w:t>
+      </w:r>
+      <w:r>
+        <w:t xml:space="preserve"> Schweizer DSG, Datenstandort Schweiz oder EU bevorzugt. Die Geheimhaltungsklauseln der Bauherrschaften werden vor jedem Standortentscheid geprüft.</w:t>
+      </w:r>
+    </w:p>
+    <w:p>
+      <w:r>
+        <w:rPr>
+          <w:b/>
+        </w:rPr>
+        <w:t>05.8 macOS bleibt.</w:t>
+      </w:r>
+      <w:r>
+        <w:t xml:space="preserve"> Mail-Versand, ArchiCAD, Cinema 4D, InDesign und Rhino sind an Macs gebunden. Die Macs bleiben Arbeitsplätze, einer dient als Mac-Worker der Plattform. Die Festplattenverschlüsselung wird nirgends abgebaut.</w:t>
+      </w:r>
+    </w:p>
+    <w:p>
+      <w:r>
+        <w:rPr>
+          <w:b/>
+        </w:rPr>
+        <w:t>05.9 Microsoft 365 und bexio bleiben.</w:t>
       </w:r>
       <w:r>
         <w:t xml:space="preserve"> SharePoint ist die Projektablage, bexio die Buchhaltung.</w:t>
@@ -2134,10 +2335,10 @@
         <w:rPr>
           <w:b/>
         </w:rPr>
-        <w:t>05.8 Etappen mit Rückfallweg.</w:t>
+        <w:t>05.10 Etappen mit Rückfallweg und Haltepunkten.</w:t>
       </w:r>
       <w:r>
-        <w:t xml:space="preserve"> Kein Big Bang. Parallelbetrieb, bis die Abnahme je Etappe gemessen ist. Die laufenden Bauprojekte mit ihren Fristen dürfen nicht stehen.</w:t>
+        <w:t xml:space="preserve"> Kein Big Bang. Parallelbetrieb, bis die Abnahme je Etappe gemessen ist. Nach jeder Etappe kann der Auftraggeber anhalten.</w:t>
       </w:r>
     </w:p>
     <w:p>
@@ -2145,10 +2346,10 @@
         <w:rPr>
           <w:b/>
         </w:rPr>
-        <w:t>05.9 Messbar.</w:t>
+        <w:t>05.11 Baustopp für Klebstoff.</w:t>
       </w:r>
       <w:r>
-        <w:t xml:space="preserve"> Jedes Paket hat Abnahmekriterien. Das bestehende Lauf-Journal liefert die Vorher-Werte.</w:t>
+        <w:t xml:space="preserve"> Ab Auftrag AP0 entstehen im Hub keine neuen Wächter, Scheduler und Queues mehr. Das Ziel soll sich während des Umbaus nicht täglich bewegen.</w:t>
       </w:r>
     </w:p>
     <w:p>
@@ -2156,10 +2357,10 @@
         <w:rPr>
           <w:b/>
         </w:rPr>
-        <w:t>05.10 Übergabefähig.</w:t>
+        <w:t>05.12 Übergabefähig.</w:t>
       </w:r>
       <w:r>
-        <w:t xml:space="preserve"> Code, Konfiguration und Dokumentation liegen im Repository des Auftraggebers. Kein proprietärer Lock-in, offene Standards, dokumentierter Ausstieg.</w:t>
+        <w:t xml:space="preserve"> Code, Konfiguration und Dokumentation liegen im Repository des Auftraggebers. Kein proprietärer Lock-in, dokumentierter Ausstieg, Nachbau durch eine zweite Fachperson möglich.</w:t>
       </w:r>
     </w:p>
     <w:p>
@@ -2178,12 +2379,12 @@
         <w:t>06.0 Übersicht.</w:t>
       </w:r>
       <w:r>
-        <w:t xml:space="preserve"> Stufe 1 beseitigt die kritischen Befunde. Stufe 2 hebt Qualität und Wissen. Stufe 3 öffnet das System für Dritte.</w:t>
+        <w:t xml:space="preserve"> Stufe 1 ist der kleine Kern und beseitigt die kritischen Befunde. Die Ausbaupakete werden einzeln und nur bei ihrem Auslöser bestellt.</w:t>
       </w:r>
     </w:p>
     <w:tbl>
       <w:tblPr>
-        <w:tblW w:type="auto" w:w="0"/>
+        <w:tblW w:type="dxa" w:w="9639"/>
         <w:tblLayout w:type="fixed"/>
         <w:tblLook w:firstColumn="1" w:firstRow="1" w:lastColumn="0" w:lastRow="0" w:noHBand="0" w:noVBand="1" w:val="04A0"/>
         <w:tblBorders>
@@ -2196,10 +2397,10 @@
         </w:tblBorders>
       </w:tblPr>
       <w:tblGrid>
-        <w:gridCol w:w="2409"/>
-        <w:gridCol w:w="2409"/>
-        <w:gridCol w:w="2409"/>
-        <w:gridCol w:w="2409"/>
+        <w:gridCol w:w="907"/>
+        <w:gridCol w:w="4762"/>
+        <w:gridCol w:w="1247"/>
+        <w:gridCol w:w="2721"/>
       </w:tblGrid>
       <w:tr>
         <w:trPr>
@@ -2207,7 +2408,7 @@
         </w:trPr>
         <w:tc>
           <w:tcPr>
-            <w:tcW w:type="dxa" w:w="1701"/>
+            <w:tcW w:type="dxa" w:w="907"/>
           </w:tcPr>
           <w:p>
             <w:pPr>
@@ -2225,7 +2426,7 @@
         </w:tc>
         <w:tc>
           <w:tcPr>
-            <w:tcW w:type="dxa" w:w="3515"/>
+            <w:tcW w:type="dxa" w:w="4762"/>
           </w:tcPr>
           <w:p>
             <w:pPr>
@@ -2243,7 +2444,7 @@
         </w:tc>
         <w:tc>
           <w:tcPr>
-            <w:tcW w:type="dxa" w:w="2608"/>
+            <w:tcW w:type="dxa" w:w="1247"/>
           </w:tcPr>
           <w:p>
             <w:pPr>
@@ -2261,7 +2462,7 @@
         </w:tc>
         <w:tc>
           <w:tcPr>
-            <w:tcW w:type="dxa" w:w="1814"/>
+            <w:tcW w:type="dxa" w:w="2721"/>
           </w:tcPr>
           <w:p>
             <w:pPr>
@@ -2284,7 +2485,7 @@
         </w:trPr>
         <w:tc>
           <w:tcPr>
-            <w:tcW w:type="dxa" w:w="1701"/>
+            <w:tcW w:type="dxa" w:w="907"/>
           </w:tcPr>
           <w:p>
             <w:pPr>
@@ -2301,7 +2502,7 @@
         </w:tc>
         <w:tc>
           <w:tcPr>
-            <w:tcW w:type="dxa" w:w="3515"/>
+            <w:tcW w:type="dxa" w:w="4762"/>
           </w:tcPr>
           <w:p>
             <w:pPr>
@@ -2312,13 +2513,13 @@
                 <w:rFonts w:ascii="Cambria" w:hAnsi="Cambria" w:cs="Cambria" w:eastAsia="Cambria"/>
                 <w:sz w:val="20"/>
               </w:rPr>
-              <w:t>Audit und Zielarchitektur</w:t>
+              <w:t>Audit, Zielarchitektur, Sofortmassnahmen</w:t>
             </w:r>
           </w:p>
         </w:tc>
         <w:tc>
           <w:tcPr>
-            <w:tcW w:type="dxa" w:w="2608"/>
+            <w:tcW w:type="dxa" w:w="1247"/>
           </w:tcPr>
           <w:p>
             <w:pPr>
@@ -2335,7 +2536,7 @@
         </w:tc>
         <w:tc>
           <w:tcPr>
-            <w:tcW w:type="dxa" w:w="1814"/>
+            <w:tcW w:type="dxa" w:w="2721"/>
           </w:tcPr>
           <w:p>
             <w:pPr>
@@ -2357,7 +2558,7 @@
         </w:trPr>
         <w:tc>
           <w:tcPr>
-            <w:tcW w:type="dxa" w:w="1701"/>
+            <w:tcW w:type="dxa" w:w="907"/>
           </w:tcPr>
           <w:p>
             <w:pPr>
@@ -2374,7 +2575,7 @@
         </w:tc>
         <w:tc>
           <w:tcPr>
-            <w:tcW w:type="dxa" w:w="3515"/>
+            <w:tcW w:type="dxa" w:w="4762"/>
           </w:tcPr>
           <w:p>
             <w:pPr>
@@ -2385,13 +2586,13 @@
                 <w:rFonts w:ascii="Cambria" w:hAnsi="Cambria" w:cs="Cambria" w:eastAsia="Cambria"/>
                 <w:sz w:val="20"/>
               </w:rPr>
-              <w:t>Fundament: Server, Netz, Geräte, Identität</w:t>
+              <w:t>Host, Netz, Geräte</w:t>
             </w:r>
           </w:p>
         </w:tc>
         <w:tc>
           <w:tcPr>
-            <w:tcW w:type="dxa" w:w="2608"/>
+            <w:tcW w:type="dxa" w:w="1247"/>
           </w:tcPr>
           <w:p>
             <w:pPr>
@@ -2408,7 +2609,7 @@
         </w:tc>
         <w:tc>
           <w:tcPr>
-            <w:tcW w:type="dxa" w:w="1814"/>
+            <w:tcW w:type="dxa" w:w="2721"/>
           </w:tcPr>
           <w:p>
             <w:pPr>
@@ -2430,7 +2631,7 @@
         </w:trPr>
         <w:tc>
           <w:tcPr>
-            <w:tcW w:type="dxa" w:w="1701"/>
+            <w:tcW w:type="dxa" w:w="907"/>
           </w:tcPr>
           <w:p>
             <w:pPr>
@@ -2447,7 +2648,7 @@
         </w:tc>
         <w:tc>
           <w:tcPr>
-            <w:tcW w:type="dxa" w:w="3515"/>
+            <w:tcW w:type="dxa" w:w="4762"/>
           </w:tcPr>
           <w:p>
             <w:pPr>
@@ -2458,13 +2659,13 @@
                 <w:rFonts w:ascii="Cambria" w:hAnsi="Cambria" w:cs="Cambria" w:eastAsia="Cambria"/>
                 <w:sz w:val="20"/>
               </w:rPr>
-              <w:t>Daten, Sync und Backup</w:t>
+              <w:t>Backup, Restore, Notfallhandbuch</w:t>
             </w:r>
           </w:p>
         </w:tc>
         <w:tc>
           <w:tcPr>
-            <w:tcW w:type="dxa" w:w="2608"/>
+            <w:tcW w:type="dxa" w:w="1247"/>
           </w:tcPr>
           <w:p>
             <w:pPr>
@@ -2481,7 +2682,226 @@
         </w:tc>
         <w:tc>
           <w:tcPr>
-            <w:tcW w:type="dxa" w:w="1814"/>
+            <w:tcW w:type="dxa" w:w="2721"/>
+          </w:tcPr>
+          <w:p>
+            <w:pPr>
+              <w:spacing w:line="276" w:lineRule="auto" w:after="60" w:before="20"/>
+            </w:pPr>
+            <w:r>
+              <w:rPr>
+                <w:rFonts w:ascii="Cambria" w:hAnsi="Cambria" w:cs="Cambria" w:eastAsia="Cambria"/>
+                <w:sz w:val="20"/>
+              </w:rPr>
+              <w:t>Ingenieur</w:t>
+            </w:r>
+          </w:p>
+        </w:tc>
+      </w:tr>
+      <w:tr>
+        <w:trPr>
+          <w:cantSplit/>
+        </w:trPr>
+        <w:tc>
+          <w:tcPr>
+            <w:tcW w:type="dxa" w:w="907"/>
+          </w:tcPr>
+          <w:p>
+            <w:pPr>
+              <w:spacing w:line="276" w:lineRule="auto" w:after="60" w:before="20"/>
+            </w:pPr>
+            <w:r>
+              <w:rPr>
+                <w:rFonts w:ascii="Cambria" w:hAnsi="Cambria" w:cs="Cambria" w:eastAsia="Cambria"/>
+                <w:sz w:val="20"/>
+              </w:rPr>
+              <w:t>AP3</w:t>
+            </w:r>
+          </w:p>
+        </w:tc>
+        <w:tc>
+          <w:tcPr>
+            <w:tcW w:type="dxa" w:w="4762"/>
+          </w:tcPr>
+          <w:p>
+            <w:pPr>
+              <w:spacing w:line="276" w:lineRule="auto" w:after="60" w:before="20"/>
+            </w:pPr>
+            <w:r>
+              <w:rPr>
+                <w:rFonts w:ascii="Cambria" w:hAnsi="Cambria" w:cs="Cambria" w:eastAsia="Cambria"/>
+                <w:sz w:val="20"/>
+              </w:rPr>
+              <w:t>Monitoring und Alarm</w:t>
+            </w:r>
+          </w:p>
+        </w:tc>
+        <w:tc>
+          <w:tcPr>
+            <w:tcW w:type="dxa" w:w="1247"/>
+          </w:tcPr>
+          <w:p>
+            <w:pPr>
+              <w:spacing w:line="276" w:lineRule="auto" w:after="60" w:before="20"/>
+            </w:pPr>
+            <w:r>
+              <w:rPr>
+                <w:rFonts w:ascii="Cambria" w:hAnsi="Cambria" w:cs="Cambria" w:eastAsia="Cambria"/>
+                <w:sz w:val="20"/>
+              </w:rPr>
+              <w:t>1</w:t>
+            </w:r>
+          </w:p>
+        </w:tc>
+        <w:tc>
+          <w:tcPr>
+            <w:tcW w:type="dxa" w:w="2721"/>
+          </w:tcPr>
+          <w:p>
+            <w:pPr>
+              <w:spacing w:line="276" w:lineRule="auto" w:after="60" w:before="20"/>
+            </w:pPr>
+            <w:r>
+              <w:rPr>
+                <w:rFonts w:ascii="Cambria" w:hAnsi="Cambria" w:cs="Cambria" w:eastAsia="Cambria"/>
+                <w:sz w:val="20"/>
+              </w:rPr>
+              <w:t>Ingenieur</w:t>
+            </w:r>
+          </w:p>
+        </w:tc>
+      </w:tr>
+      <w:tr>
+        <w:trPr>
+          <w:cantSplit/>
+        </w:trPr>
+        <w:tc>
+          <w:tcPr>
+            <w:tcW w:type="dxa" w:w="907"/>
+          </w:tcPr>
+          <w:p>
+            <w:pPr>
+              <w:spacing w:line="276" w:lineRule="auto" w:after="60" w:before="20"/>
+            </w:pPr>
+            <w:r>
+              <w:rPr>
+                <w:rFonts w:ascii="Cambria" w:hAnsi="Cambria" w:cs="Cambria" w:eastAsia="Cambria"/>
+                <w:sz w:val="20"/>
+              </w:rPr>
+              <w:t>AP4</w:t>
+            </w:r>
+          </w:p>
+        </w:tc>
+        <w:tc>
+          <w:tcPr>
+            <w:tcW w:type="dxa" w:w="4762"/>
+          </w:tcPr>
+          <w:p>
+            <w:pPr>
+              <w:spacing w:line="276" w:lineRule="auto" w:after="60" w:before="20"/>
+            </w:pPr>
+            <w:r>
+              <w:rPr>
+                <w:rFonts w:ascii="Cambria" w:hAnsi="Cambria" w:cs="Cambria" w:eastAsia="Cambria"/>
+                <w:sz w:val="20"/>
+              </w:rPr>
+              <w:t>Secrets und Least Privilege</w:t>
+            </w:r>
+          </w:p>
+        </w:tc>
+        <w:tc>
+          <w:tcPr>
+            <w:tcW w:type="dxa" w:w="1247"/>
+          </w:tcPr>
+          <w:p>
+            <w:pPr>
+              <w:spacing w:line="276" w:lineRule="auto" w:after="60" w:before="20"/>
+            </w:pPr>
+            <w:r>
+              <w:rPr>
+                <w:rFonts w:ascii="Cambria" w:hAnsi="Cambria" w:cs="Cambria" w:eastAsia="Cambria"/>
+                <w:sz w:val="20"/>
+              </w:rPr>
+              <w:t>1</w:t>
+            </w:r>
+          </w:p>
+        </w:tc>
+        <w:tc>
+          <w:tcPr>
+            <w:tcW w:type="dxa" w:w="2721"/>
+          </w:tcPr>
+          <w:p>
+            <w:pPr>
+              <w:spacing w:line="276" w:lineRule="auto" w:after="60" w:before="20"/>
+            </w:pPr>
+            <w:r>
+              <w:rPr>
+                <w:rFonts w:ascii="Cambria" w:hAnsi="Cambria" w:cs="Cambria" w:eastAsia="Cambria"/>
+                <w:sz w:val="20"/>
+              </w:rPr>
+              <w:t>Ingenieur</w:t>
+            </w:r>
+          </w:p>
+        </w:tc>
+      </w:tr>
+      <w:tr>
+        <w:trPr>
+          <w:cantSplit/>
+        </w:trPr>
+        <w:tc>
+          <w:tcPr>
+            <w:tcW w:type="dxa" w:w="907"/>
+          </w:tcPr>
+          <w:p>
+            <w:pPr>
+              <w:spacing w:line="276" w:lineRule="auto" w:after="60" w:before="20"/>
+            </w:pPr>
+            <w:r>
+              <w:rPr>
+                <w:rFonts w:ascii="Cambria" w:hAnsi="Cambria" w:cs="Cambria" w:eastAsia="Cambria"/>
+                <w:sz w:val="20"/>
+              </w:rPr>
+              <w:t>AP5</w:t>
+            </w:r>
+          </w:p>
+        </w:tc>
+        <w:tc>
+          <w:tcPr>
+            <w:tcW w:type="dxa" w:w="4762"/>
+          </w:tcPr>
+          <w:p>
+            <w:pPr>
+              <w:spacing w:line="276" w:lineRule="auto" w:after="60" w:before="20"/>
+            </w:pPr>
+            <w:r>
+              <w:rPr>
+                <w:rFonts w:ascii="Cambria" w:hAnsi="Cambria" w:cs="Cambria" w:eastAsia="Cambria"/>
+                <w:sz w:val="20"/>
+              </w:rPr>
+              <w:t>Daten und Sync</w:t>
+            </w:r>
+          </w:p>
+        </w:tc>
+        <w:tc>
+          <w:tcPr>
+            <w:tcW w:type="dxa" w:w="1247"/>
+          </w:tcPr>
+          <w:p>
+            <w:pPr>
+              <w:spacing w:line="276" w:lineRule="auto" w:after="60" w:before="20"/>
+            </w:pPr>
+            <w:r>
+              <w:rPr>
+                <w:rFonts w:ascii="Cambria" w:hAnsi="Cambria" w:cs="Cambria" w:eastAsia="Cambria"/>
+                <w:sz w:val="20"/>
+              </w:rPr>
+              <w:t>1</w:t>
+            </w:r>
+          </w:p>
+        </w:tc>
+        <w:tc>
+          <w:tcPr>
+            <w:tcW w:type="dxa" w:w="2721"/>
           </w:tcPr>
           <w:p>
             <w:pPr>
@@ -2503,7 +2923,7 @@
         </w:trPr>
         <w:tc>
           <w:tcPr>
-            <w:tcW w:type="dxa" w:w="1701"/>
+            <w:tcW w:type="dxa" w:w="907"/>
           </w:tcPr>
           <w:p>
             <w:pPr>
@@ -2514,13 +2934,13 @@
                 <w:rFonts w:ascii="Cambria" w:hAnsi="Cambria" w:cs="Cambria" w:eastAsia="Cambria"/>
                 <w:sz w:val="20"/>
               </w:rPr>
-              <w:t>AP3</w:t>
+              <w:t>AP6</w:t>
             </w:r>
           </w:p>
         </w:tc>
         <w:tc>
           <w:tcPr>
-            <w:tcW w:type="dxa" w:w="3515"/>
+            <w:tcW w:type="dxa" w:w="4762"/>
           </w:tcPr>
           <w:p>
             <w:pPr>
@@ -2531,13 +2951,13 @@
                 <w:rFonts w:ascii="Cambria" w:hAnsi="Cambria" w:cs="Cambria" w:eastAsia="Cambria"/>
                 <w:sz w:val="20"/>
               </w:rPr>
-              <w:t>Laufzeit und Job-System</w:t>
+              <w:t>Job-System und Agenten-Laufzeit</w:t>
             </w:r>
           </w:p>
         </w:tc>
         <w:tc>
           <w:tcPr>
-            <w:tcW w:type="dxa" w:w="2608"/>
+            <w:tcW w:type="dxa" w:w="1247"/>
           </w:tcPr>
           <w:p>
             <w:pPr>
@@ -2554,7 +2974,80 @@
         </w:tc>
         <w:tc>
           <w:tcPr>
-            <w:tcW w:type="dxa" w:w="1814"/>
+            <w:tcW w:type="dxa" w:w="2721"/>
+          </w:tcPr>
+          <w:p>
+            <w:pPr>
+              <w:spacing w:line="276" w:lineRule="auto" w:after="60" w:before="20"/>
+            </w:pPr>
+            <w:r>
+              <w:rPr>
+                <w:rFonts w:ascii="Cambria" w:hAnsi="Cambria" w:cs="Cambria" w:eastAsia="Cambria"/>
+                <w:sz w:val="20"/>
+              </w:rPr>
+              <w:t>gemeinsam</w:t>
+            </w:r>
+          </w:p>
+        </w:tc>
+      </w:tr>
+      <w:tr>
+        <w:trPr>
+          <w:cantSplit/>
+        </w:trPr>
+        <w:tc>
+          <w:tcPr>
+            <w:tcW w:type="dxa" w:w="907"/>
+          </w:tcPr>
+          <w:p>
+            <w:pPr>
+              <w:spacing w:line="276" w:lineRule="auto" w:after="60" w:before="20"/>
+            </w:pPr>
+            <w:r>
+              <w:rPr>
+                <w:rFonts w:ascii="Cambria" w:hAnsi="Cambria" w:cs="Cambria" w:eastAsia="Cambria"/>
+                <w:sz w:val="20"/>
+              </w:rPr>
+              <w:t>AP7</w:t>
+            </w:r>
+          </w:p>
+        </w:tc>
+        <w:tc>
+          <w:tcPr>
+            <w:tcW w:type="dxa" w:w="4762"/>
+          </w:tcPr>
+          <w:p>
+            <w:pPr>
+              <w:spacing w:line="276" w:lineRule="auto" w:after="60" w:before="20"/>
+            </w:pPr>
+            <w:r>
+              <w:rPr>
+                <w:rFonts w:ascii="Cambria" w:hAnsi="Cambria" w:cs="Cambria" w:eastAsia="Cambria"/>
+                <w:sz w:val="20"/>
+              </w:rPr>
+              <w:t>Agentische Sicherheit und Freigabeschicht</w:t>
+            </w:r>
+          </w:p>
+        </w:tc>
+        <w:tc>
+          <w:tcPr>
+            <w:tcW w:type="dxa" w:w="1247"/>
+          </w:tcPr>
+          <w:p>
+            <w:pPr>
+              <w:spacing w:line="276" w:lineRule="auto" w:after="60" w:before="20"/>
+            </w:pPr>
+            <w:r>
+              <w:rPr>
+                <w:rFonts w:ascii="Cambria" w:hAnsi="Cambria" w:cs="Cambria" w:eastAsia="Cambria"/>
+                <w:sz w:val="20"/>
+              </w:rPr>
+              <w:t>1</w:t>
+            </w:r>
+          </w:p>
+        </w:tc>
+        <w:tc>
+          <w:tcPr>
+            <w:tcW w:type="dxa" w:w="2721"/>
           </w:tcPr>
           <w:p>
             <w:pPr>
@@ -2576,7 +3069,7 @@
         </w:trPr>
         <w:tc>
           <w:tcPr>
-            <w:tcW w:type="dxa" w:w="1701"/>
+            <w:tcW w:type="dxa" w:w="907"/>
           </w:tcPr>
           <w:p>
             <w:pPr>
@@ -2587,13 +3080,13 @@
                 <w:rFonts w:ascii="Cambria" w:hAnsi="Cambria" w:cs="Cambria" w:eastAsia="Cambria"/>
                 <w:sz w:val="20"/>
               </w:rPr>
-              <w:t>AP4</w:t>
+              <w:t>AP8</w:t>
             </w:r>
           </w:p>
         </w:tc>
         <w:tc>
           <w:tcPr>
-            <w:tcW w:type="dxa" w:w="3515"/>
+            <w:tcW w:type="dxa" w:w="4762"/>
           </w:tcPr>
           <w:p>
             <w:pPr>
@@ -2604,13 +3097,13 @@
                 <w:rFonts w:ascii="Cambria" w:hAnsi="Cambria" w:cs="Cambria" w:eastAsia="Cambria"/>
                 <w:sz w:val="20"/>
               </w:rPr>
-              <w:t>Sicherheit, Secrets, Freigabeschicht</w:t>
+              <w:t>Datenschutz nach DSG</w:t>
             </w:r>
           </w:p>
         </w:tc>
         <w:tc>
           <w:tcPr>
-            <w:tcW w:type="dxa" w:w="2608"/>
+            <w:tcW w:type="dxa" w:w="1247"/>
           </w:tcPr>
           <w:p>
             <w:pPr>
@@ -2627,7 +3120,153 @@
         </w:tc>
         <w:tc>
           <w:tcPr>
-            <w:tcW w:type="dxa" w:w="1814"/>
+            <w:tcW w:type="dxa" w:w="2721"/>
+          </w:tcPr>
+          <w:p>
+            <w:pPr>
+              <w:spacing w:line="276" w:lineRule="auto" w:after="60" w:before="20"/>
+            </w:pPr>
+            <w:r>
+              <w:rPr>
+                <w:rFonts w:ascii="Cambria" w:hAnsi="Cambria" w:cs="Cambria" w:eastAsia="Cambria"/>
+                <w:sz w:val="20"/>
+              </w:rPr>
+              <w:t>gemeinsam</w:t>
+            </w:r>
+          </w:p>
+        </w:tc>
+      </w:tr>
+      <w:tr>
+        <w:trPr>
+          <w:cantSplit/>
+        </w:trPr>
+        <w:tc>
+          <w:tcPr>
+            <w:tcW w:type="dxa" w:w="907"/>
+          </w:tcPr>
+          <w:p>
+            <w:pPr>
+              <w:spacing w:line="276" w:lineRule="auto" w:after="60" w:before="20"/>
+            </w:pPr>
+            <w:r>
+              <w:rPr>
+                <w:rFonts w:ascii="Cambria" w:hAnsi="Cambria" w:cs="Cambria" w:eastAsia="Cambria"/>
+                <w:sz w:val="20"/>
+              </w:rPr>
+              <w:t>AP9</w:t>
+            </w:r>
+          </w:p>
+        </w:tc>
+        <w:tc>
+          <w:tcPr>
+            <w:tcW w:type="dxa" w:w="4762"/>
+          </w:tcPr>
+          <w:p>
+            <w:pPr>
+              <w:spacing w:line="276" w:lineRule="auto" w:after="60" w:before="20"/>
+            </w:pPr>
+            <w:r>
+              <w:rPr>
+                <w:rFonts w:ascii="Cambria" w:hAnsi="Cambria" w:cs="Cambria" w:eastAsia="Cambria"/>
+                <w:sz w:val="20"/>
+              </w:rPr>
+              <w:t>Delivery: Review, CI, Evals</w:t>
+            </w:r>
+          </w:p>
+        </w:tc>
+        <w:tc>
+          <w:tcPr>
+            <w:tcW w:type="dxa" w:w="1247"/>
+          </w:tcPr>
+          <w:p>
+            <w:pPr>
+              <w:spacing w:line="276" w:lineRule="auto" w:after="60" w:before="20"/>
+            </w:pPr>
+            <w:r>
+              <w:rPr>
+                <w:rFonts w:ascii="Cambria" w:hAnsi="Cambria" w:cs="Cambria" w:eastAsia="Cambria"/>
+                <w:sz w:val="20"/>
+              </w:rPr>
+              <w:t>1</w:t>
+            </w:r>
+          </w:p>
+        </w:tc>
+        <w:tc>
+          <w:tcPr>
+            <w:tcW w:type="dxa" w:w="2721"/>
+          </w:tcPr>
+          <w:p>
+            <w:pPr>
+              <w:spacing w:line="276" w:lineRule="auto" w:after="60" w:before="20"/>
+            </w:pPr>
+            <w:r>
+              <w:rPr>
+                <w:rFonts w:ascii="Cambria" w:hAnsi="Cambria" w:cs="Cambria" w:eastAsia="Cambria"/>
+                <w:sz w:val="20"/>
+              </w:rPr>
+              <w:t>gemeinsam</w:t>
+            </w:r>
+          </w:p>
+        </w:tc>
+      </w:tr>
+      <w:tr>
+        <w:trPr>
+          <w:cantSplit/>
+        </w:trPr>
+        <w:tc>
+          <w:tcPr>
+            <w:tcW w:type="dxa" w:w="907"/>
+          </w:tcPr>
+          <w:p>
+            <w:pPr>
+              <w:spacing w:line="276" w:lineRule="auto" w:after="60" w:before="20"/>
+            </w:pPr>
+            <w:r>
+              <w:rPr>
+                <w:rFonts w:ascii="Cambria" w:hAnsi="Cambria" w:cs="Cambria" w:eastAsia="Cambria"/>
+                <w:sz w:val="20"/>
+              </w:rPr>
+              <w:t>AP10</w:t>
+            </w:r>
+          </w:p>
+        </w:tc>
+        <w:tc>
+          <w:tcPr>
+            <w:tcW w:type="dxa" w:w="4762"/>
+          </w:tcPr>
+          <w:p>
+            <w:pPr>
+              <w:spacing w:line="276" w:lineRule="auto" w:after="60" w:before="20"/>
+            </w:pPr>
+            <w:r>
+              <w:rPr>
+                <w:rFonts w:ascii="Cambria" w:hAnsi="Cambria" w:cs="Cambria" w:eastAsia="Cambria"/>
+                <w:sz w:val="20"/>
+              </w:rPr>
+              <w:t>Rückbau, Übergabe, Wartung</w:t>
+            </w:r>
+          </w:p>
+        </w:tc>
+        <w:tc>
+          <w:tcPr>
+            <w:tcW w:type="dxa" w:w="1247"/>
+          </w:tcPr>
+          <w:p>
+            <w:pPr>
+              <w:spacing w:line="276" w:lineRule="auto" w:after="60" w:before="20"/>
+            </w:pPr>
+            <w:r>
+              <w:rPr>
+                <w:rFonts w:ascii="Cambria" w:hAnsi="Cambria" w:cs="Cambria" w:eastAsia="Cambria"/>
+                <w:sz w:val="20"/>
+              </w:rPr>
+              <w:t>1</w:t>
+            </w:r>
+          </w:p>
+        </w:tc>
+        <w:tc>
+          <w:tcPr>
+            <w:tcW w:type="dxa" w:w="2721"/>
           </w:tcPr>
           <w:p>
             <w:pPr>
@@ -2649,7 +3288,7 @@
         </w:trPr>
         <w:tc>
           <w:tcPr>
-            <w:tcW w:type="dxa" w:w="1701"/>
+            <w:tcW w:type="dxa" w:w="907"/>
           </w:tcPr>
           <w:p>
             <w:pPr>
@@ -2660,13 +3299,13 @@
                 <w:rFonts w:ascii="Cambria" w:hAnsi="Cambria" w:cs="Cambria" w:eastAsia="Cambria"/>
                 <w:sz w:val="20"/>
               </w:rPr>
-              <w:t>AP5</w:t>
+              <w:t>AP11</w:t>
             </w:r>
           </w:p>
         </w:tc>
         <w:tc>
           <w:tcPr>
-            <w:tcW w:type="dxa" w:w="3515"/>
+            <w:tcW w:type="dxa" w:w="4762"/>
           </w:tcPr>
           <w:p>
             <w:pPr>
@@ -2677,13 +3316,13 @@
                 <w:rFonts w:ascii="Cambria" w:hAnsi="Cambria" w:cs="Cambria" w:eastAsia="Cambria"/>
                 <w:sz w:val="20"/>
               </w:rPr>
-              <w:t>Datenschutz nach DSG</w:t>
+              <w:t>Studio-Hosting mit Anmeldung</w:t>
             </w:r>
           </w:p>
         </w:tc>
         <w:tc>
           <w:tcPr>
-            <w:tcW w:type="dxa" w:w="2608"/>
+            <w:tcW w:type="dxa" w:w="1247"/>
           </w:tcPr>
           <w:p>
             <w:pPr>
@@ -2694,13 +3333,86 @@
                 <w:rFonts w:ascii="Cambria" w:hAnsi="Cambria" w:cs="Cambria" w:eastAsia="Cambria"/>
                 <w:sz w:val="20"/>
               </w:rPr>
-              <w:t>1</w:t>
+              <w:t>Ausbau</w:t>
             </w:r>
           </w:p>
         </w:tc>
         <w:tc>
           <w:tcPr>
-            <w:tcW w:type="dxa" w:w="1814"/>
+            <w:tcW w:type="dxa" w:w="2721"/>
+          </w:tcPr>
+          <w:p>
+            <w:pPr>
+              <w:spacing w:line="276" w:lineRule="auto" w:after="60" w:before="20"/>
+            </w:pPr>
+            <w:r>
+              <w:rPr>
+                <w:rFonts w:ascii="Cambria" w:hAnsi="Cambria" w:cs="Cambria" w:eastAsia="Cambria"/>
+                <w:sz w:val="20"/>
+              </w:rPr>
+              <w:t>Ingenieur</w:t>
+            </w:r>
+          </w:p>
+        </w:tc>
+      </w:tr>
+      <w:tr>
+        <w:trPr>
+          <w:cantSplit/>
+        </w:trPr>
+        <w:tc>
+          <w:tcPr>
+            <w:tcW w:type="dxa" w:w="907"/>
+          </w:tcPr>
+          <w:p>
+            <w:pPr>
+              <w:spacing w:line="276" w:lineRule="auto" w:after="60" w:before="20"/>
+            </w:pPr>
+            <w:r>
+              <w:rPr>
+                <w:rFonts w:ascii="Cambria" w:hAnsi="Cambria" w:cs="Cambria" w:eastAsia="Cambria"/>
+                <w:sz w:val="20"/>
+              </w:rPr>
+              <w:t>AP12</w:t>
+            </w:r>
+          </w:p>
+        </w:tc>
+        <w:tc>
+          <w:tcPr>
+            <w:tcW w:type="dxa" w:w="4762"/>
+          </w:tcPr>
+          <w:p>
+            <w:pPr>
+              <w:spacing w:line="276" w:lineRule="auto" w:after="60" w:before="20"/>
+            </w:pPr>
+            <w:r>
+              <w:rPr>
+                <w:rFonts w:ascii="Cambria" w:hAnsi="Cambria" w:cs="Cambria" w:eastAsia="Cambria"/>
+                <w:sz w:val="20"/>
+              </w:rPr>
+              <w:t>Wissensplattform mit Hybrid-Suche</w:t>
+            </w:r>
+          </w:p>
+        </w:tc>
+        <w:tc>
+          <w:tcPr>
+            <w:tcW w:type="dxa" w:w="1247"/>
+          </w:tcPr>
+          <w:p>
+            <w:pPr>
+              <w:spacing w:line="276" w:lineRule="auto" w:after="60" w:before="20"/>
+            </w:pPr>
+            <w:r>
+              <w:rPr>
+                <w:rFonts w:ascii="Cambria" w:hAnsi="Cambria" w:cs="Cambria" w:eastAsia="Cambria"/>
+                <w:sz w:val="20"/>
+              </w:rPr>
+              <w:t>Ausbau</w:t>
+            </w:r>
+          </w:p>
+        </w:tc>
+        <w:tc>
+          <w:tcPr>
+            <w:tcW w:type="dxa" w:w="2721"/>
           </w:tcPr>
           <w:p>
             <w:pPr>
@@ -2722,7 +3434,7 @@
         </w:trPr>
         <w:tc>
           <w:tcPr>
-            <w:tcW w:type="dxa" w:w="1701"/>
+            <w:tcW w:type="dxa" w:w="907"/>
           </w:tcPr>
           <w:p>
             <w:pPr>
@@ -2733,13 +3445,13 @@
                 <w:rFonts w:ascii="Cambria" w:hAnsi="Cambria" w:cs="Cambria" w:eastAsia="Cambria"/>
                 <w:sz w:val="20"/>
               </w:rPr>
-              <w:t>AP6</w:t>
+              <w:t>AP13</w:t>
             </w:r>
           </w:p>
         </w:tc>
         <w:tc>
           <w:tcPr>
-            <w:tcW w:type="dxa" w:w="3515"/>
+            <w:tcW w:type="dxa" w:w="4762"/>
           </w:tcPr>
           <w:p>
             <w:pPr>
@@ -2750,13 +3462,13 @@
                 <w:rFonts w:ascii="Cambria" w:hAnsi="Cambria" w:cs="Cambria" w:eastAsia="Cambria"/>
                 <w:sz w:val="20"/>
               </w:rPr>
-              <w:t>Monitoring, Alarm, Notfallhandbuch</w:t>
+              <w:t>Integrations-Hub (MCP)</w:t>
             </w:r>
           </w:p>
         </w:tc>
         <w:tc>
           <w:tcPr>
-            <w:tcW w:type="dxa" w:w="2608"/>
+            <w:tcW w:type="dxa" w:w="1247"/>
           </w:tcPr>
           <w:p>
             <w:pPr>
@@ -2767,86 +3479,13 @@
                 <w:rFonts w:ascii="Cambria" w:hAnsi="Cambria" w:cs="Cambria" w:eastAsia="Cambria"/>
                 <w:sz w:val="20"/>
               </w:rPr>
-              <w:t>1</w:t>
+              <w:t>Ausbau</w:t>
             </w:r>
           </w:p>
         </w:tc>
         <w:tc>
           <w:tcPr>
-            <w:tcW w:type="dxa" w:w="1814"/>
-          </w:tcPr>
-          <w:p>
-            <w:pPr>
-              <w:spacing w:line="276" w:lineRule="auto" w:after="60" w:before="20"/>
-            </w:pPr>
-            <w:r>
-              <w:rPr>
-                <w:rFonts w:ascii="Cambria" w:hAnsi="Cambria" w:cs="Cambria" w:eastAsia="Cambria"/>
-                <w:sz w:val="20"/>
-              </w:rPr>
-              <w:t>Ingenieur</w:t>
-            </w:r>
-          </w:p>
-        </w:tc>
-      </w:tr>
-      <w:tr>
-        <w:trPr>
-          <w:cantSplit/>
-        </w:trPr>
-        <w:tc>
-          <w:tcPr>
-            <w:tcW w:type="dxa" w:w="1701"/>
-          </w:tcPr>
-          <w:p>
-            <w:pPr>
-              <w:spacing w:line="276" w:lineRule="auto" w:after="60" w:before="20"/>
-            </w:pPr>
-            <w:r>
-              <w:rPr>
-                <w:rFonts w:ascii="Cambria" w:hAnsi="Cambria" w:cs="Cambria" w:eastAsia="Cambria"/>
-                <w:sz w:val="20"/>
-              </w:rPr>
-              <w:t>AP7</w:t>
-            </w:r>
-          </w:p>
-        </w:tc>
-        <w:tc>
-          <w:tcPr>
-            <w:tcW w:type="dxa" w:w="3515"/>
-          </w:tcPr>
-          <w:p>
-            <w:pPr>
-              <w:spacing w:line="276" w:lineRule="auto" w:after="60" w:before="20"/>
-            </w:pPr>
-            <w:r>
-              <w:rPr>
-                <w:rFonts w:ascii="Cambria" w:hAnsi="Cambria" w:cs="Cambria" w:eastAsia="Cambria"/>
-                <w:sz w:val="20"/>
-              </w:rPr>
-              <w:t>Integrations-Hub und Delivery</w:t>
-            </w:r>
-          </w:p>
-        </w:tc>
-        <w:tc>
-          <w:tcPr>
-            <w:tcW w:type="dxa" w:w="2608"/>
-          </w:tcPr>
-          <w:p>
-            <w:pPr>
-              <w:spacing w:line="276" w:lineRule="auto" w:after="60" w:before="20"/>
-            </w:pPr>
-            <w:r>
-              <w:rPr>
-                <w:rFonts w:ascii="Cambria" w:hAnsi="Cambria" w:cs="Cambria" w:eastAsia="Cambria"/>
-                <w:sz w:val="20"/>
-              </w:rPr>
-              <w:t>2</w:t>
-            </w:r>
-          </w:p>
-        </w:tc>
-        <w:tc>
-          <w:tcPr>
-            <w:tcW w:type="dxa" w:w="1814"/>
+            <w:tcW w:type="dxa" w:w="2721"/>
           </w:tcPr>
           <w:p>
             <w:pPr>
@@ -2868,7 +3507,7 @@
         </w:trPr>
         <w:tc>
           <w:tcPr>
-            <w:tcW w:type="dxa" w:w="1701"/>
+            <w:tcW w:type="dxa" w:w="907"/>
           </w:tcPr>
           <w:p>
             <w:pPr>
@@ -2879,13 +3518,13 @@
                 <w:rFonts w:ascii="Cambria" w:hAnsi="Cambria" w:cs="Cambria" w:eastAsia="Cambria"/>
                 <w:sz w:val="20"/>
               </w:rPr>
-              <w:t>AP8</w:t>
+              <w:t>AP14</w:t>
             </w:r>
           </w:p>
         </w:tc>
         <w:tc>
           <w:tcPr>
-            <w:tcW w:type="dxa" w:w="3515"/>
+            <w:tcW w:type="dxa" w:w="4762"/>
           </w:tcPr>
           <w:p>
             <w:pPr>
@@ -2896,13 +3535,13 @@
                 <w:rFonts w:ascii="Cambria" w:hAnsi="Cambria" w:cs="Cambria" w:eastAsia="Cambria"/>
                 <w:sz w:val="20"/>
               </w:rPr>
-              <w:t>Wissensplattform mit Hybrid-Suche</w:t>
+              <w:t>Mitarbeitende, Mandanten, Portal</w:t>
             </w:r>
           </w:p>
         </w:tc>
         <w:tc>
           <w:tcPr>
-            <w:tcW w:type="dxa" w:w="2608"/>
+            <w:tcW w:type="dxa" w:w="1247"/>
           </w:tcPr>
           <w:p>
             <w:pPr>
@@ -2913,159 +3552,13 @@
                 <w:rFonts w:ascii="Cambria" w:hAnsi="Cambria" w:cs="Cambria" w:eastAsia="Cambria"/>
                 <w:sz w:val="20"/>
               </w:rPr>
-              <w:t>2</w:t>
+              <w:t>Ausbau</w:t>
             </w:r>
           </w:p>
         </w:tc>
         <w:tc>
           <w:tcPr>
-            <w:tcW w:type="dxa" w:w="1814"/>
-          </w:tcPr>
-          <w:p>
-            <w:pPr>
-              <w:spacing w:line="276" w:lineRule="auto" w:after="60" w:before="20"/>
-            </w:pPr>
-            <w:r>
-              <w:rPr>
-                <w:rFonts w:ascii="Cambria" w:hAnsi="Cambria" w:cs="Cambria" w:eastAsia="Cambria"/>
-                <w:sz w:val="20"/>
-              </w:rPr>
-              <w:t>gemeinsam</w:t>
-            </w:r>
-          </w:p>
-        </w:tc>
-      </w:tr>
-      <w:tr>
-        <w:trPr>
-          <w:cantSplit/>
-        </w:trPr>
-        <w:tc>
-          <w:tcPr>
-            <w:tcW w:type="dxa" w:w="1701"/>
-          </w:tcPr>
-          <w:p>
-            <w:pPr>
-              <w:spacing w:line="276" w:lineRule="auto" w:after="60" w:before="20"/>
-            </w:pPr>
-            <w:r>
-              <w:rPr>
-                <w:rFonts w:ascii="Cambria" w:hAnsi="Cambria" w:cs="Cambria" w:eastAsia="Cambria"/>
-                <w:sz w:val="20"/>
-              </w:rPr>
-              <w:t>AP9</w:t>
-            </w:r>
-          </w:p>
-        </w:tc>
-        <w:tc>
-          <w:tcPr>
-            <w:tcW w:type="dxa" w:w="3515"/>
-          </w:tcPr>
-          <w:p>
-            <w:pPr>
-              <w:spacing w:line="276" w:lineRule="auto" w:after="60" w:before="20"/>
-            </w:pPr>
-            <w:r>
-              <w:rPr>
-                <w:rFonts w:ascii="Cambria" w:hAnsi="Cambria" w:cs="Cambria" w:eastAsia="Cambria"/>
-                <w:sz w:val="20"/>
-              </w:rPr>
-              <w:t>Mehrbenutzer, Mandanten, Kundenportal</w:t>
-            </w:r>
-          </w:p>
-        </w:tc>
-        <w:tc>
-          <w:tcPr>
-            <w:tcW w:type="dxa" w:w="2608"/>
-          </w:tcPr>
-          <w:p>
-            <w:pPr>
-              <w:spacing w:line="276" w:lineRule="auto" w:after="60" w:before="20"/>
-            </w:pPr>
-            <w:r>
-              <w:rPr>
-                <w:rFonts w:ascii="Cambria" w:hAnsi="Cambria" w:cs="Cambria" w:eastAsia="Cambria"/>
-                <w:sz w:val="20"/>
-              </w:rPr>
-              <w:t>3</w:t>
-            </w:r>
-          </w:p>
-        </w:tc>
-        <w:tc>
-          <w:tcPr>
-            <w:tcW w:type="dxa" w:w="1814"/>
-          </w:tcPr>
-          <w:p>
-            <w:pPr>
-              <w:spacing w:line="276" w:lineRule="auto" w:after="60" w:before="20"/>
-            </w:pPr>
-            <w:r>
-              <w:rPr>
-                <w:rFonts w:ascii="Cambria" w:hAnsi="Cambria" w:cs="Cambria" w:eastAsia="Cambria"/>
-                <w:sz w:val="20"/>
-              </w:rPr>
-              <w:t>Ingenieur</w:t>
-            </w:r>
-          </w:p>
-        </w:tc>
-      </w:tr>
-      <w:tr>
-        <w:trPr>
-          <w:cantSplit/>
-        </w:trPr>
-        <w:tc>
-          <w:tcPr>
-            <w:tcW w:type="dxa" w:w="1701"/>
-          </w:tcPr>
-          <w:p>
-            <w:pPr>
-              <w:spacing w:line="276" w:lineRule="auto" w:after="60" w:before="20"/>
-            </w:pPr>
-            <w:r>
-              <w:rPr>
-                <w:rFonts w:ascii="Cambria" w:hAnsi="Cambria" w:cs="Cambria" w:eastAsia="Cambria"/>
-                <w:sz w:val="20"/>
-              </w:rPr>
-              <w:t>AP10</w:t>
-            </w:r>
-          </w:p>
-        </w:tc>
-        <w:tc>
-          <w:tcPr>
-            <w:tcW w:type="dxa" w:w="3515"/>
-          </w:tcPr>
-          <w:p>
-            <w:pPr>
-              <w:spacing w:line="276" w:lineRule="auto" w:after="60" w:before="20"/>
-            </w:pPr>
-            <w:r>
-              <w:rPr>
-                <w:rFonts w:ascii="Cambria" w:hAnsi="Cambria" w:cs="Cambria" w:eastAsia="Cambria"/>
-                <w:sz w:val="20"/>
-              </w:rPr>
-              <w:t>Betrieb und Wartung</w:t>
-            </w:r>
-          </w:p>
-        </w:tc>
-        <w:tc>
-          <w:tcPr>
-            <w:tcW w:type="dxa" w:w="2608"/>
-          </w:tcPr>
-          <w:p>
-            <w:pPr>
-              <w:spacing w:line="276" w:lineRule="auto" w:after="60" w:before="20"/>
-            </w:pPr>
-            <w:r>
-              <w:rPr>
-                <w:rFonts w:ascii="Cambria" w:hAnsi="Cambria" w:cs="Cambria" w:eastAsia="Cambria"/>
-                <w:sz w:val="20"/>
-              </w:rPr>
-              <w:t>laufend</w:t>
-            </w:r>
-          </w:p>
-        </w:tc>
-        <w:tc>
-          <w:tcPr>
-            <w:tcW w:type="dxa" w:w="1814"/>
+            <w:tcW w:type="dxa" w:w="2721"/>
           </w:tcPr>
           <w:p>
             <w:pPr>
@@ -3087,10 +3580,10 @@
         <w:rPr>
           <w:b/>
         </w:rPr>
-        <w:t>06.1 AP0 Audit und Zielarchitektur.</w:t>
+        <w:t>06.1 AP0 Audit, Zielarchitektur, Sofortmassnahmen.</w:t>
       </w:r>
       <w:r>
-        <w:t xml:space="preserve"> Verifikation des Befundkatalogs am lebenden System, Bedrohungsmodell für ein agentisches System, Zielarchitektur mit mindestens zwei Varianten (eigener Server im Büro, gehostet in der Schweiz oder EU, Mischform), Betriebskosten über drei Jahre, Migrationsplan in Etappen. Ergebnis: Architekturdokument, Entscheidvorlage, verbindliche Preise für AP1 bis AP6. Abnahme: jeder kritische Befund ist einem Paket und einer Massnahme zugeordnet.</w:t>
+        <w:t xml:space="preserve"> Verifikation des Befundkatalogs am lebenden System, auch der Punkte, die aus dem Repository nicht prüfbar sind (NAS, Firewall, Tailnet, Entra, GitHub). Bedrohungsmodell für ein agentisches System. Abhängigkeitskarte aller Routinen und der Entscheid, welche gar nicht migriert werden. Kostenmodell der KI-Nutzung in drei Szenarien aus den Journaldaten. Zielarchitektur mit mindestens zwei Varianten und den Kosten über drei Jahre. Ein moderierter Entscheid-Workshop mit Vorschlagswerten für den Inhaber. Sofortmassnahmen in der ersten Woche: Backup nachweisen und eine Datei wirklich zurückholen, zweiter Alarmkanal, Dead-Man-Switch für Tagesbriefing und Fristen-Radar, Zwischenschutz für schreibende Aktionen. Abnahme: jeder kritische Befund ist einem Paket zugeordnet, je Schicht liegt ein Architekturentscheid vor, die Preise für AP1 bis AP10 sind verbindlich.</w:t>
       </w:r>
     </w:p>
     <w:p>
@@ -3098,10 +3591,10 @@
         <w:rPr>
           <w:b/>
         </w:rPr>
-        <w:t>06.2 AP1 Fundament.</w:t>
+        <w:t>06.2 AP1 Host, Netz, Geräte.</w:t>
       </w:r>
       <w:r>
-        <w:t xml:space="preserve"> Dedizierter, headless betriebener Server (oder gehostete Entsprechung), unbeaufsichtigter Wiederanlauf ohne Abbau der Verschlüsselung, USV, Netz in Zonen, Fernzugang mit ACL, Geräteverwaltung für die Macs, ein Konto je Person auf Basis der bestehenden Microsoft-365-Identitäten. Abnahme: Stromausfall-Probe bestanden, alle Dienste starten ohne Anmeldung einer Person, ein verlorenes Notebook ist innert einer Stunde gesperrt und seine Schlüssel sind widerrufen.</w:t>
+        <w:t xml:space="preserve"> Ein kleiner, headless betriebener Linux-Host oder eine gleichwertige VM bei einem Schweizer Hoster, verschlüsselt mit unbeaufsichtigtem Wiederanlauf, USV, Konfiguration als Code. Netz in Zonen, Fernzugang als Systemdienst mit ACL und Schlüsselablauf. Schlanke Geräteverwaltung für die drei Macs mit Schlüssel-Hinterlegung und Fernlöschung, saubere Neuinstallation der dritten Station. Abnahme: Stecker-Probe bestanden (alle Dienste ohne Person innert 10 Minuten zurück, Datenträger bleiben verschlüsselt), Host in zwei Stunden aus dem Repository neu aufgesetzt, ein verlorenes Notebook innert einer Stunde gesperrt und seine Schlüssel widerrufen.</w:t>
       </w:r>
     </w:p>
     <w:p>
@@ -3109,10 +3602,10 @@
         <w:rPr>
           <w:b/>
         </w:rPr>
-        <w:t>06.3 AP2 Daten, Sync und Backup.</w:t>
+        <w:t>06.3 AP2 Backup, Restore, Notfallhandbuch.</w:t>
       </w:r>
       <w:r>
-        <w:t xml:space="preserve"> SMB aus dem kritischen Pfad, aufbauend auf der vorhandenen Systemanalyse. Schnitt des Repository in Code, Wissen, Zustand, Telemetrie und Artefakte. Register und Journale in eine Datenbank, Binärdaten in einen Objektspeicher. Kapazitätsplanung und Nachfolge für das NAS. Sicherung nach 3-2-1 für Bürodaten, Microsoft 365 und bexio. Abnahme: ein Mount-Abriss stoppt keinen Hub-Lauf, Wiederherstellungsprobe protokolliert, RPO und RTO je Datenklasse vereinbart und erreicht.</w:t>
+        <w:t xml:space="preserve"> Dateninventar mit RPO und RTO je Klasse. Sicherung nach 3-2-1 für Bürodaten, Host, Microsoft 365 und bexio, mit verschlüsseltem Ziel ausser Haus. Kapazitäts- und Nachfolgeentscheid für das NAS, Speicherstrategie für den SharePoint-Pool. Berechtigungsmodell des Dateiservers je Person, Dienst und Datenklasse. Löschkonzept, das mit unveränderbaren Sicherungen vereinbar ist. Notfallhandbuch je Szenario samt Stellvertretung. Abnahme: protokollierte Wiederherstellung je Datenklasse, RPO und RTO vom Inhaber unterschrieben und in der Probe eingehalten, eine Notfallübung durchgeführt.</w:t>
       </w:r>
     </w:p>
     <w:p>
@@ -3120,10 +3613,10 @@
         <w:rPr>
           <w:b/>
         </w:rPr>
-        <w:t>06.4 AP3 Laufzeit und Job-System.</w:t>
+        <w:t>06.4 AP3 Monitoring und Alarm.</w:t>
       </w:r>
       <w:r>
-        <w:t xml:space="preserve"> Ein Scheduler mit persistentem Zustand, Retry mit Obergrenze, Timeout, Idempotenz, Budget je Lauf, Nachholen verpasster Läufe und Abbruch bei fehlendem Ertrag. Einheitliche Agenten-Laufzeit mit genau einer Anmeldungsquelle. Migration aller Routinen, Mac-Worker für gebundene Aufgaben. Klärung Abo gegen API samt Nutzungsbedingungen und Kosten. Abnahme: Fehlläufe unter 5 %, jede Routine mit Takt, letztem Ergebnis und nächstem Lauf an einem Ort sichtbar, operative Aufsicht läuft unabhängig von den Lern-Loops.</w:t>
+        <w:t xml:space="preserve"> Überwachung ausserhalb der überwachten Systeme: Erfolgs-Heartbeat je Job, Erreichbarkeit von aussen, echter Lese-Check je Connector, Ablauf aller Tokens und Zertifikate, Zustand und Füllstand von NAS und SharePoint, Uhrendrift der Stationen. Alarm über einen unabhängigen Kanal mit Zustellnachweis und Eskalation. Abnahme: simulierter Ausfall von Host, NAS, Tunnel und einem Aufsichtsjob ist je innert 15 Minuten auf dem Telefon des Inhabers, auch bei geschlossenem Mail-Client und leerem KI-Kontingent.</w:t>
       </w:r>
     </w:p>
     <w:p>
@@ -3131,10 +3624,10 @@
         <w:rPr>
           <w:b/>
         </w:rPr>
-        <w:t>06.5 AP4 Sicherheit, Secrets, Freigabeschicht.</w:t>
+        <w:t>06.5 AP4 Secrets und Least Privilege.</w:t>
       </w:r>
       <w:r>
-        <w:t xml:space="preserve"> Least Privilege für alle Umsysteme, Schlüssel je Gerät, zentraler Secrets-Speicher mit Rotation. Berechtigungsprofile je Jobklasse und Sandbox für unbeaufsichtigte Läufe. Architektur gegen Prompt-Injection: ein werkzeugloser Agent liest, nur strukturierte Daten erreichen den handelnden Agenten. Freigabeschicht ausserhalb der KI für schreibende Aktionen mit Betrags- und Mengengrenzen, signierte Aufträge statt Ausführung aus Dateien, unveränderliches Audit-Log. Abnahme: Red-Team-Probe mit präparierten Mails ohne Wirkung, kein Klartext-Secret auf einer Station, jede Aussenwirkung im Audit-Log.</w:t>
+        <w:t xml:space="preserve"> Ein Secrets-Speicher als einzige Quelle mit Inventar, Rotation und Ablaufüberwachung. Rechte der Microsoft-365-Anbindung auf das Nötige zugeschnitten und getrennt nach Lesen, Schreiben, Senden, Schlüssel je Gerät und nicht exportierbar. Härtung des Git-Kontos. Abnahme: kein Klartext-Secret auf einer Station oder dem NAS, keine Anbindung mit tenantweiten Vollrechten mehr aktiv, alte Zugänge erst deaktiviert und nach 30 Tagen gelöscht.</w:t>
       </w:r>
     </w:p>
     <w:p>
@@ -3142,10 +3635,10 @@
         <w:rPr>
           <w:b/>
         </w:rPr>
-        <w:t>06.6 AP5 Datenschutz nach DSG.</w:t>
+        <w:t>06.6 AP5 Daten und Sync.</w:t>
       </w:r>
       <w:r>
-        <w:t xml:space="preserve"> Datenklassen, Bearbeitungsverzeichnis, Übersicht der Auftragsbearbeiter mit Datenstandort, Lösch- und Aufbewahrungskonzept. Personendaten aus Grundkontext und Repository in einen zugriffsgesteuerten Speicher. Technisch erzwungene Ausschlusslisten, Prüfung auf Personendaten und Secrets vor jedem Commit, Entscheidvorlage zur Bereinigung der Historie. Trennung lizenzierter Inhalte. Juristische Fragen benennen Sie, beantworten muss sie eine Rechtsfachperson. Abnahme: kein Personendatum in neuem Commit möglich, Verzeichnis und Verträge liegen vor.</w:t>
+        <w:t xml:space="preserve"> SMB aus dem kritischen Pfad, aufbauend auf der vorhandenen Systemanalyse: Git als einzige Quelle, lokale Klone, Pfadauflösung per Konfiguration. Schnitt des Repository in Plattform, Harness, Wissen und Privates. Register, Journale und Telemetrie in die Datenbank, mit Kommandozeile für die Agenten und lesbarem Export. Binärdaten in den Objektspeicher. Hub-Ausgaben serverseitig in SharePoint statt über lokale Sync-Ordner. Abnahme: alle Stationen arbeiten bei ausgehängtem NAS, kein Status-Commit mehr, 14 Tage ohne Divergenz.</w:t>
       </w:r>
     </w:p>
     <w:p>
@@ -3153,10 +3646,10 @@
         <w:rPr>
           <w:b/>
         </w:rPr>
-        <w:t>06.7 AP6 Monitoring, Alarm, Notfallhandbuch.</w:t>
+        <w:t>06.7 AP6 Job-System und Agenten-Laufzeit.</w:t>
       </w:r>
       <w:r>
-        <w:t xml:space="preserve"> Überwachung ausserhalb der überwachten Systeme, Erfolgs-Heartbeat je Job, Erreichbarkeit von aussen, zentrale Logs mit Aufbewahrung, Kennzahlen zu Kapazität, Job-Erfolg und Kosten. Alarm über einen unabhängigen Kanal mit Zustellnachweis. Runbooks aus der Betriebs-Chronik, Notfallhandbuch mit Stellvertretung. Abnahme: ein simulierter Ausfall von NAS, Tunnel oder Scheduler ist innert 15 Minuten auf dem Telefon des Inhabers.</w:t>
+        <w:t xml:space="preserve"> Ein Scheduler mit persistentem Zustand, Retry mit Obergrenze, Timeout, Idempotenz, Budget je Lauf, Nachholen und Abbruch bei fehlendem Ertrag. Eine Agenten-Laufzeit mit gepinnter Version und genau einer Anmeldungsquelle, je Jobklasse umstellbar zwischen Abo und API. Mac-Worker unter eigenem macOS-Benutzer nur mit dem Geschäftskonto, der Aufträge abholt statt von aussen angesprochen zu werden. Migration in Wellen: Aufsicht zuerst im Schattenbetrieb (beide erzeugen, nur das alte System sendet), operative Jobs danach, Lern-Loops zuletzt. Getrennte Kontingente für operative und lernende Läufe. Authentisierter Weg, unterwegs Aufträge einzureichen. Abnahme: technische Fehlläufe unter 5 % über 14 Tage (Kontingent-Aufschübe zählen als aufgeschoben), kein Doppellauf, Tagesbriefing und Fristen-Radar 14 Tage in Folge geliefert, jede Routine mit Takt, letztem Ergebnis und nächstem Lauf an einem Ort sichtbar.</w:t>
       </w:r>
     </w:p>
     <w:p>
@@ -3164,10 +3657,10 @@
         <w:rPr>
           <w:b/>
         </w:rPr>
-        <w:t>06.8 AP7 Integrations-Hub und Delivery.</w:t>
+        <w:t>06.8 AP7 Agentische Sicherheit und Freigabeschicht.</w:t>
       </w:r>
       <w:r>
-        <w:t xml:space="preserve"> Typisierte MCP-Server je Domäne mit gemeinsamem SDK (Timeout, Retry, Fehlerklassen), synthetische Checks je Connector, Sanierung der fragilen Portal-Logins. Review, CI, Staging und Releases für Skills, Regeln und Scripts. Evaluations-Suite aus den vorhandenen Goldstandards. Abnahme: keine Änderung erreicht die Produktion ohne grüne Pipeline, jeder Connector meldet seinen Ausfall am selben Tag.</w:t>
+        <w:t xml:space="preserve"> Berechtigungsprofile je Jobklasse, vom werkzeuglosen Leser für Mail, Web und PDF bis zum aussenwirksamen Profil, auch für interaktive Sitzungen und Cloud-Connectoren. Freigabeschicht ausserhalb der KI für senden, buchen, mahnen und Berechtigungen ändern: Regeln als Code, Betrags- und Mengengrenzen, authentisierte Freigabe per Push, zuerst beobachtend, dann erzwingend. Die KI hält die Schreibzugänge zu Mailversand und Buchhaltung nie selbst. Signierte Aufträge statt Ausführung aus Dateien. Audit-Log ausserhalb der Schreibreichweite der Agenten. Testkonten für Buchhaltung, Postfach und SharePoint. Abnahme: wiederkehrende Red-Team-Suite in der CI mit null Aussenwirkungen und null Datenabflüssen, die Freigabeschicht verweigert bei eigenem Ausfall, Änderungen an Policy und Profilen nur durch benannte Personen.</w:t>
       </w:r>
     </w:p>
     <w:p>
@@ -3175,10 +3668,10 @@
         <w:rPr>
           <w:b/>
         </w:rPr>
-        <w:t>06.9 AP8 Wissensplattform.</w:t>
+        <w:t>06.9 AP8 Datenschutz nach DSG.</w:t>
       </w:r>
       <w:r>
-        <w:t xml:space="preserve"> Selbst gehostete Volltext- und Vektorsuche über alle Wissensbasen mit Metadatenfiltern, als MCP-Dienst. Provenienz mit Dokument-ID und Quellversion, Schema-Validierung, Staging für automatische Läufe, Evaluations-Sets je Wissensbasis. Abnahme: gemessene Trefferquote auf einem Goldfragen-Set, sinkender Tokenverbrauch je Anfrage.</w:t>
+        <w:t xml:space="preserve"> Datenklassen, Bearbeitungsverzeichnis, Übersicht der Auftragsbearbeiter mit Datenstandort, Lösch- und Aufbewahrungskonzept, Folgenabschätzung für das agentische System, Ablauf bei einer Verletzung der Datensicherheit. Klärung der Vertragsgrundlage der KI-Nutzung, auch der interaktiven. Personendaten aus Grundkontext und Repository in einen zugriffsgesteuerten, löschfähigen Speicher. Repositories mit bereinigtem Stand neu aufsetzen, das alte einfrieren. Technisch erzwungene Ausschlusslisten. Juristische Fragen benennen Sie, beantworten muss sie eine Rechtsfachperson, die der Auftraggeber früh beizieht. Abnahme: ein gesperrter Ordner ist für Inventar- und Lernläufe technisch nicht lesbar, ein Commit mit Personendaten oder Secret wird abgewiesen, Verzeichnis und Verträge liegen vor.</w:t>
       </w:r>
     </w:p>
     <w:p>
@@ -3186,10 +3679,10 @@
         <w:rPr>
           <w:b/>
         </w:rPr>
-        <w:t>06.10 AP9 Mehrbenutzer, Mandanten, Kundenportal.</w:t>
+        <w:t>06.10 AP9 Delivery.</w:t>
       </w:r>
       <w:r>
-        <w:t xml:space="preserve"> Rollen für Mitarbeitende, Mandantenräume für Einzelfirma, AG und Partnerbüros, Kundenportal mit Anmeldung, Ablaufdatum, Widerruf und Zugriffsprotokoll, reproduzierbares Deployment, Hosting in der Schweiz oder EU. Abnahme: eine neue Person ist in zwei Stunden arbeitsfähig und sieht nur ihre Hubs.</w:t>
+        <w:t xml:space="preserve"> Branch, Review, CI, Tag und Rollback für Plattform und Harness. Produktion zieht nur freigegebene Stände. Lern-Loops schreiben in einen Staging-Zweig mit Diff-Gate, die Selbstverbesserung erzeugt Vorschläge statt Direktedits. Festgelegt ist, welche Änderungsklassen nach grüner Prüfung automatisch übernommen werden und welche der Inhaber freigibt, auf dem Telefon, mit einem Klick und Frist. Evaluations-Suite aus den vorhandenen Goldstandards, Tests der fachlichen Rechenkerne, gepinnte Werkzeuge. Abnahme: direkter Push in die Produktion ist auch für Bots gesperrt, Grundkontext dauerhaft unter 100 kB, Rollback in 10 Minuten vorgeführt.</w:t>
       </w:r>
     </w:p>
     <w:p>
@@ -3197,10 +3690,54 @@
         <w:rPr>
           <w:b/>
         </w:rPr>
-        <w:t>06.11 AP10 Betrieb und Wartung.</w:t>
+        <w:t>06.11 AP10 Rückbau, Übergabe, Wartung.</w:t>
       </w:r>
       <w:r>
-        <w:t xml:space="preserve"> Wartungsvertrag mit Reaktionszeiten, Patch-Fenstern, Stellvertretung, halbjährlichem Review und Kostenübersicht. Abnahme: vereinbarte Reaktionszeit wird eingehalten und quartalsweise ausgewiesen.</w:t>
+        <w:t xml:space="preserve"> Stilllegen des Klebstoffs mit 60 Tagen Vorhaltung. Runbooks aus der Betriebs-Chronik, auch für Sicherheitsvorfälle. Schulung des Inhabers. Wartungsvertrag mit Reaktionszeiten, Patch-Fenstern, Stellvertretung, halbjährlichem Review und Kostenübersicht. Abnahme: eine zweite Fachperson baut einen Dienst aus dem Repository nach, der gesunkene Betriebsaufwand des Inhabers ist nach drei Monaten gemessen.</w:t>
+      </w:r>
+    </w:p>
+    <w:p>
+      <w:r>
+        <w:rPr>
+          <w:b/>
+        </w:rPr>
+        <w:t>06.12 AP11 Studio-Hosting mit Anmeldung.</w:t>
+      </w:r>
+      <w:r>
+        <w:t xml:space="preserve"> Auslöser: der nächste zahlende Studio-Kunde. Statisches Hosting in der Schweiz oder EU hinter Anmeldung, mit Ablaufdatum, Widerruf, Zugriffsprotokoll und Deployment aus versionierter Quelle. Rechenkern aus einer Quelle mit Paritätstests. Dieses Paket ist klein und darf früh kommen, weil es das nächste verkaufbare Produkt trägt.</w:t>
+      </w:r>
+    </w:p>
+    <w:p>
+      <w:r>
+        <w:rPr>
+          <w:b/>
+        </w:rPr>
+        <w:t>06.13 AP12 Wissensplattform.</w:t>
+      </w:r>
+      <w:r>
+        <w:t xml:space="preserve"> Auslöser: messbar bremsendes Retrieval. Volltext- und Vektorsuche über alle Wissensbasen, Provenienz mit Dokument-ID und Quellversion, Evaluations-Sets je Wissensbasis, Auslieferung als ein Werkzeug für die Agenten. Die Erschliessung des Archivs mit 1.9 TB ist ein eigenes Vorhaben und nicht Teil dieses Pakets.</w:t>
+      </w:r>
+    </w:p>
+    <w:p>
+      <w:r>
+        <w:rPr>
+          <w:b/>
+        </w:rPr>
+        <w:t>06.14 AP13 Integrations-Hub.</w:t>
+      </w:r>
+      <w:r>
+        <w:t xml:space="preserve"> Auslöser: neue Integrationen oder Mitarbeitende, die dieselben Werkzeuge brauchen. Typisierte MCP-Server je Domäne, gemeinsames Connector-SDK, Katalog als Daten, Sanierung der fragilen Portal-Logins.</w:t>
+      </w:r>
+    </w:p>
+    <w:p>
+      <w:r>
+        <w:rPr>
+          <w:b/>
+        </w:rPr>
+        <w:t>06.15 AP14 Mitarbeitende, Mandanten, Portal.</w:t>
+      </w:r>
+      <w:r>
+        <w:t xml:space="preserve"> Auslöser: erste Anstellung, Start der AG, erster Partnervertrag. Rollen, Zugriff im Namen der anfragenden Person, Mandantenräume, Portal für Partner und Bauherrschaften.</w:t>
       </w:r>
     </w:p>
     <w:p>
@@ -3219,7 +3756,7 @@
         <w:t>07.1 Der Ingenieur</w:t>
       </w:r>
       <w:r>
-        <w:t xml:space="preserve"> baut und verantwortet den Plattform-Hub, setzt die Leitplanken für die KI und nimmt Plattform-Änderungen ab.</w:t>
+        <w:t xml:space="preserve"> baut und verantwortet den Plattform-Hub, setzt die Leitplanken für die KI und nimmt Änderungen an Plattform, Policy und Profilen ab. Er ist selbst Auftragsbearbeiter mit hohen Rechten: benanntes Admin-Konto mit MFA, zeitlich begrenzte Rechte, protokollierte Eingriffe, geregelter Austritt.</w:t>
       </w:r>
     </w:p>
     <w:p>
@@ -3230,7 +3767,7 @@
         <w:t>07.2 Das Büro mit der KI</w:t>
       </w:r>
       <w:r>
-        <w:t xml:space="preserve"> baut die Fach-Hubs weiter, migriert Skills und Routinen auf die neue Plattform und liefert Messwerte und Dokumentation zu.</w:t>
+        <w:t xml:space="preserve"> baut die Fach-Hubs weiter, stellt Pfade und Routinen auf die neue Plattform um und liefert Messwerte und Dokumentation zu. Diese Eigenleistung weisen Sie in der Offerte je Paket aus.</w:t>
       </w:r>
     </w:p>
     <w:p>
@@ -3241,7 +3778,7 @@
         <w:t>07.3 Der Inhaber</w:t>
       </w:r>
       <w:r>
-        <w:t xml:space="preserve"> entscheidet Varianten, Budget, Datenstandort und Freigaben und nimmt jede Etappe ab.</w:t>
+        <w:t xml:space="preserve"> entscheidet Varianten, Budget, Datenstandort und Freigaben und nimmt jede Etappe ab. Sein Zeitbedarf je Woche steht in der Offerte.</w:t>
       </w:r>
     </w:p>
     <w:p>
@@ -3265,7 +3802,7 @@
     </w:p>
     <w:tbl>
       <w:tblPr>
-        <w:tblW w:type="auto" w:w="0"/>
+        <w:tblW w:type="dxa" w:w="9639"/>
         <w:tblLayout w:type="fixed"/>
         <w:tblLook w:firstColumn="1" w:firstRow="1" w:lastColumn="0" w:lastRow="0" w:noHBand="0" w:noVBand="1" w:val="04A0"/>
         <w:tblBorders>
@@ -3278,9 +3815,9 @@
         </w:tblBorders>
       </w:tblPr>
       <w:tblGrid>
-        <w:gridCol w:w="3213"/>
-        <w:gridCol w:w="3213"/>
-        <w:gridCol w:w="3213"/>
+        <w:gridCol w:w="1134"/>
+        <w:gridCol w:w="4422"/>
+        <w:gridCol w:w="4082"/>
       </w:tblGrid>
       <w:tr>
         <w:trPr>
@@ -3288,7 +3825,7 @@
         </w:trPr>
         <w:tc>
           <w:tcPr>
-            <w:tcW w:type="dxa" w:w="2154"/>
+            <w:tcW w:type="dxa" w:w="1134"/>
           </w:tcPr>
           <w:p>
             <w:pPr>
@@ -3306,7 +3843,7 @@
         </w:tc>
         <w:tc>
           <w:tcPr>
-            <w:tcW w:type="dxa" w:w="4082"/>
+            <w:tcW w:type="dxa" w:w="4422"/>
           </w:tcPr>
           <w:p>
             <w:pPr>
@@ -3324,7 +3861,7 @@
         </w:tc>
         <w:tc>
           <w:tcPr>
-            <w:tcW w:type="dxa" w:w="3402"/>
+            <w:tcW w:type="dxa" w:w="4082"/>
           </w:tcPr>
           <w:p>
             <w:pPr>
@@ -3347,7 +3884,7 @@
         </w:trPr>
         <w:tc>
           <w:tcPr>
-            <w:tcW w:type="dxa" w:w="2154"/>
+            <w:tcW w:type="dxa" w:w="1134"/>
           </w:tcPr>
           <w:p>
             <w:pPr>
@@ -3364,7 +3901,7 @@
         </w:tc>
         <w:tc>
           <w:tcPr>
-            <w:tcW w:type="dxa" w:w="4082"/>
+            <w:tcW w:type="dxa" w:w="4422"/>
           </w:tcPr>
           <w:p>
             <w:pPr>
@@ -3381,7 +3918,7 @@
         </w:tc>
         <w:tc>
           <w:tcPr>
-            <w:tcW w:type="dxa" w:w="3402"/>
+            <w:tcW w:type="dxa" w:w="4082"/>
           </w:tcPr>
           <w:p>
             <w:pPr>
@@ -3403,7 +3940,7 @@
         </w:trPr>
         <w:tc>
           <w:tcPr>
-            <w:tcW w:type="dxa" w:w="2154"/>
+            <w:tcW w:type="dxa" w:w="1134"/>
           </w:tcPr>
           <w:p>
             <w:pPr>
@@ -3420,7 +3957,7 @@
         </w:tc>
         <w:tc>
           <w:tcPr>
-            <w:tcW w:type="dxa" w:w="4082"/>
+            <w:tcW w:type="dxa" w:w="4422"/>
           </w:tcPr>
           <w:p>
             <w:pPr>
@@ -3431,13 +3968,13 @@
                 <w:rFonts w:ascii="Cambria" w:hAnsi="Cambria" w:cs="Cambria" w:eastAsia="Cambria"/>
                 <w:sz w:val="20"/>
               </w:rPr>
-              <w:t>AP0</w:t>
+              <w:t>AP0 mit Sofortmassnahmen</w:t>
             </w:r>
           </w:p>
         </w:tc>
         <w:tc>
           <w:tcPr>
-            <w:tcW w:type="dxa" w:w="3402"/>
+            <w:tcW w:type="dxa" w:w="4082"/>
           </w:tcPr>
           <w:p>
             <w:pPr>
@@ -3459,7 +3996,7 @@
         </w:trPr>
         <w:tc>
           <w:tcPr>
-            <w:tcW w:type="dxa" w:w="2154"/>
+            <w:tcW w:type="dxa" w:w="1134"/>
           </w:tcPr>
           <w:p>
             <w:pPr>
@@ -3476,6 +4013,23 @@
         </w:tc>
         <w:tc>
           <w:tcPr>
+            <w:tcW w:type="dxa" w:w="4422"/>
+          </w:tcPr>
+          <w:p>
+            <w:pPr>
+              <w:spacing w:line="276" w:lineRule="auto" w:after="60" w:before="20"/>
+            </w:pPr>
+            <w:r>
+              <w:rPr>
+                <w:rFonts w:ascii="Cambria" w:hAnsi="Cambria" w:cs="Cambria" w:eastAsia="Cambria"/>
+                <w:sz w:val="20"/>
+              </w:rPr>
+              <w:t>Risiko zuerst: AP1 bis AP4</w:t>
+            </w:r>
+          </w:p>
+        </w:tc>
+        <w:tc>
+          <w:tcPr>
             <w:tcW w:type="dxa" w:w="4082"/>
           </w:tcPr>
           <w:p>
@@ -3487,24 +4041,7 @@
                 <w:rFonts w:ascii="Cambria" w:hAnsi="Cambria" w:cs="Cambria" w:eastAsia="Cambria"/>
                 <w:sz w:val="20"/>
               </w:rPr>
-              <w:t>AP1, AP2, AP6</w:t>
-            </w:r>
-          </w:p>
-        </w:tc>
-        <w:tc>
-          <w:tcPr>
-            <w:tcW w:type="dxa" w:w="3402"/>
-          </w:tcPr>
-          <w:p>
-            <w:pPr>
-              <w:spacing w:line="276" w:lineRule="auto" w:after="60" w:before="20"/>
-            </w:pPr>
-            <w:r>
-              <w:rPr>
-                <w:rFonts w:ascii="Cambria" w:hAnsi="Cambria" w:cs="Cambria" w:eastAsia="Cambria"/>
-                <w:sz w:val="20"/>
-              </w:rPr>
-              <w:t>stabiles Fundament, gesicherte Daten, Alarm</w:t>
+              <w:t>gesicherte Daten, Alarm, enge Rechte. Haltepunkt</w:t>
             </w:r>
           </w:p>
         </w:tc>
@@ -3515,7 +4052,7 @@
         </w:trPr>
         <w:tc>
           <w:tcPr>
-            <w:tcW w:type="dxa" w:w="2154"/>
+            <w:tcW w:type="dxa" w:w="1134"/>
           </w:tcPr>
           <w:p>
             <w:pPr>
@@ -3532,6 +4069,23 @@
         </w:tc>
         <w:tc>
           <w:tcPr>
+            <w:tcW w:type="dxa" w:w="4422"/>
+          </w:tcPr>
+          <w:p>
+            <w:pPr>
+              <w:spacing w:line="276" w:lineRule="auto" w:after="60" w:before="20"/>
+            </w:pPr>
+            <w:r>
+              <w:rPr>
+                <w:rFonts w:ascii="Cambria" w:hAnsi="Cambria" w:cs="Cambria" w:eastAsia="Cambria"/>
+                <w:sz w:val="20"/>
+              </w:rPr>
+              <w:t>Daten und Laufzeit: AP5, AP6, danach vier Wochen Messung</w:t>
+            </w:r>
+          </w:p>
+        </w:tc>
+        <w:tc>
+          <w:tcPr>
             <w:tcW w:type="dxa" w:w="4082"/>
           </w:tcPr>
           <w:p>
@@ -3543,24 +4097,7 @@
                 <w:rFonts w:ascii="Cambria" w:hAnsi="Cambria" w:cs="Cambria" w:eastAsia="Cambria"/>
                 <w:sz w:val="20"/>
               </w:rPr>
-              <w:t>AP3, AP4, AP5</w:t>
-            </w:r>
-          </w:p>
-        </w:tc>
-        <w:tc>
-          <w:tcPr>
-            <w:tcW w:type="dxa" w:w="3402"/>
-          </w:tcPr>
-          <w:p>
-            <w:pPr>
-              <w:spacing w:line="276" w:lineRule="auto" w:after="60" w:before="20"/>
-            </w:pPr>
-            <w:r>
-              <w:rPr>
-                <w:rFonts w:ascii="Cambria" w:hAnsi="Cambria" w:cs="Cambria" w:eastAsia="Cambria"/>
-                <w:sz w:val="20"/>
-              </w:rPr>
-              <w:t>eine Laufzeit, Least Privilege, DSG-Rahmen</w:t>
+              <w:t>ein Job-System ohne SMB. Haltepunkt</w:t>
             </w:r>
           </w:p>
         </w:tc>
@@ -3571,7 +4108,7 @@
         </w:trPr>
         <w:tc>
           <w:tcPr>
-            <w:tcW w:type="dxa" w:w="2154"/>
+            <w:tcW w:type="dxa" w:w="1134"/>
           </w:tcPr>
           <w:p>
             <w:pPr>
@@ -3588,6 +4125,23 @@
         </w:tc>
         <w:tc>
           <w:tcPr>
+            <w:tcW w:type="dxa" w:w="4422"/>
+          </w:tcPr>
+          <w:p>
+            <w:pPr>
+              <w:spacing w:line="276" w:lineRule="auto" w:after="60" w:before="20"/>
+            </w:pPr>
+            <w:r>
+              <w:rPr>
+                <w:rFonts w:ascii="Cambria" w:hAnsi="Cambria" w:cs="Cambria" w:eastAsia="Cambria"/>
+                <w:sz w:val="20"/>
+              </w:rPr>
+              <w:t>Härtung: AP7, AP8, AP9</w:t>
+            </w:r>
+          </w:p>
+        </w:tc>
+        <w:tc>
+          <w:tcPr>
             <w:tcW w:type="dxa" w:w="4082"/>
           </w:tcPr>
           <w:p>
@@ -3599,24 +4153,7 @@
                 <w:rFonts w:ascii="Cambria" w:hAnsi="Cambria" w:cs="Cambria" w:eastAsia="Cambria"/>
                 <w:sz w:val="20"/>
               </w:rPr>
-              <w:t>AP7, AP8</w:t>
-            </w:r>
-          </w:p>
-        </w:tc>
-        <w:tc>
-          <w:tcPr>
-            <w:tcW w:type="dxa" w:w="3402"/>
-          </w:tcPr>
-          <w:p>
-            <w:pPr>
-              <w:spacing w:line="276" w:lineRule="auto" w:after="60" w:before="20"/>
-            </w:pPr>
-            <w:r>
-              <w:rPr>
-                <w:rFonts w:ascii="Cambria" w:hAnsi="Cambria" w:cs="Cambria" w:eastAsia="Cambria"/>
-                <w:sz w:val="20"/>
-              </w:rPr>
-              <w:t>Integration, Tests, Suche</w:t>
+              <w:t>Freigabeschicht, DSG-Rahmen, geprüfte Releases</w:t>
             </w:r>
           </w:p>
         </w:tc>
@@ -3627,7 +4164,7 @@
         </w:trPr>
         <w:tc>
           <w:tcPr>
-            <w:tcW w:type="dxa" w:w="2154"/>
+            <w:tcW w:type="dxa" w:w="1134"/>
           </w:tcPr>
           <w:p>
             <w:pPr>
@@ -3644,7 +4181,7 @@
         </w:tc>
         <w:tc>
           <w:tcPr>
-            <w:tcW w:type="dxa" w:w="4082"/>
+            <w:tcW w:type="dxa" w:w="4422"/>
           </w:tcPr>
           <w:p>
             <w:pPr>
@@ -3655,46 +4192,7 @@
                 <w:rFonts w:ascii="Cambria" w:hAnsi="Cambria" w:cs="Cambria" w:eastAsia="Cambria"/>
                 <w:sz w:val="20"/>
               </w:rPr>
-              <w:t>AP9</w:t>
-            </w:r>
-          </w:p>
-        </w:tc>
-        <w:tc>
-          <w:tcPr>
-            <w:tcW w:type="dxa" w:w="3402"/>
-          </w:tcPr>
-          <w:p>
-            <w:pPr>
-              <w:spacing w:line="276" w:lineRule="auto" w:after="60" w:before="20"/>
-            </w:pPr>
-            <w:r>
-              <w:rPr>
-                <w:rFonts w:ascii="Cambria" w:hAnsi="Cambria" w:cs="Cambria" w:eastAsia="Cambria"/>
-                <w:sz w:val="20"/>
-              </w:rPr>
-              <w:t>Öffnung für Mitarbeitende, Partner, Kundschaft</w:t>
-            </w:r>
-          </w:p>
-        </w:tc>
-      </w:tr>
-      <w:tr>
-        <w:trPr>
-          <w:cantSplit/>
-        </w:trPr>
-        <w:tc>
-          <w:tcPr>
-            <w:tcW w:type="dxa" w:w="2154"/>
-          </w:tcPr>
-          <w:p>
-            <w:pPr>
-              <w:spacing w:line="276" w:lineRule="auto" w:after="60" w:before="20"/>
-            </w:pPr>
-            <w:r>
-              <w:rPr>
-                <w:rFonts w:ascii="Cambria" w:hAnsi="Cambria" w:cs="Cambria" w:eastAsia="Cambria"/>
-                <w:sz w:val="20"/>
-              </w:rPr>
-              <w:t>laufend</w:t>
+              <w:t>AP10</w:t>
             </w:r>
           </w:p>
         </w:tc>
@@ -3711,13 +4209,18 @@
                 <w:rFonts w:ascii="Cambria" w:hAnsi="Cambria" w:cs="Cambria" w:eastAsia="Cambria"/>
                 <w:sz w:val="20"/>
               </w:rPr>
-              <w:t>AP10</w:t>
+              <w:t>Klebstoff stillgelegt, betreuter Betrieb</w:t>
             </w:r>
           </w:p>
         </w:tc>
+      </w:tr>
+      <w:tr>
+        <w:trPr>
+          <w:cantSplit/>
+        </w:trPr>
         <w:tc>
           <w:tcPr>
-            <w:tcW w:type="dxa" w:w="3402"/>
+            <w:tcW w:type="dxa" w:w="1134"/>
           </w:tcPr>
           <w:p>
             <w:pPr>
@@ -3728,7 +4231,41 @@
                 <w:rFonts w:ascii="Cambria" w:hAnsi="Cambria" w:cs="Cambria" w:eastAsia="Cambria"/>
                 <w:sz w:val="20"/>
               </w:rPr>
-              <w:t>betreuter Betrieb</w:t>
+              <w:t>Ausbau</w:t>
+            </w:r>
+          </w:p>
+        </w:tc>
+        <w:tc>
+          <w:tcPr>
+            <w:tcW w:type="dxa" w:w="4422"/>
+          </w:tcPr>
+          <w:p>
+            <w:pPr>
+              <w:spacing w:line="276" w:lineRule="auto" w:after="60" w:before="20"/>
+            </w:pPr>
+            <w:r>
+              <w:rPr>
+                <w:rFonts w:ascii="Cambria" w:hAnsi="Cambria" w:cs="Cambria" w:eastAsia="Cambria"/>
+                <w:sz w:val="20"/>
+              </w:rPr>
+              <w:t>AP11 bis AP14 je bei Auslöser</w:t>
+            </w:r>
+          </w:p>
+        </w:tc>
+        <w:tc>
+          <w:tcPr>
+            <w:tcW w:type="dxa" w:w="4082"/>
+          </w:tcPr>
+          <w:p>
+            <w:pPr>
+              <w:spacing w:line="276" w:lineRule="auto" w:after="60" w:before="20"/>
+            </w:pPr>
+            <w:r>
+              <w:rPr>
+                <w:rFonts w:ascii="Cambria" w:hAnsi="Cambria" w:cs="Cambria" w:eastAsia="Cambria"/>
+                <w:sz w:val="20"/>
+              </w:rPr>
+              <w:t>verkaufbare Produkte, Team, Mandanten</w:t>
             </w:r>
           </w:p>
         </w:tc>
@@ -3761,7 +4298,7 @@
         <w:t>09.1 Form.</w:t>
       </w:r>
       <w:r>
-        <w:t xml:space="preserve"> PDF, höchstens 15 Seiten, dazu das Preisblatt.</w:t>
+        <w:t xml:space="preserve"> PDF, höchstens 15 Seiten, dazu das Preisblatt je Paket.</w:t>
       </w:r>
     </w:p>
     <w:p>
@@ -3772,7 +4309,7 @@
         <w:t>09.2 Preise.</w:t>
       </w:r>
       <w:r>
-        <w:t xml:space="preserve"> AP0 als Festpreis. AP1 bis AP6 je als Festpreis oder Kostendach, verbindlich nach AP0. AP7 bis AP9 als Richtpreis mit Annahmen. AP10 als Monatspauschale mit Leistungsumfang, dazu Stundenansätze nach Funktion. Alle Preise in CHF, exklusive MWST, MWST ausgewiesen.</w:t>
+        <w:t xml:space="preserve"> AP0 als Festpreis. AP1 bis AP10 je als Festpreis oder Kostendach in Ingenieurtagen, verbindlich nach AP0. AP11 bis AP14 als Richtpreis mit Annahmen. Wartung als Monatspauschale mit Leistungsumfang, dazu Stundenansätze nach Funktion. Alle Preise in CHF, exklusive MWST, MWST ausgewiesen.</w:t>
       </w:r>
     </w:p>
     <w:p>
@@ -3780,10 +4317,10 @@
         <w:rPr>
           <w:b/>
         </w:rPr>
-        <w:t>09.3 Varianten.</w:t>
+        <w:t>09.3 Eigenleistung und Zeitbedarf.</w:t>
       </w:r>
       <w:r>
-        <w:t xml:space="preserve"> Mindestens zwei Architekturvarianten mit den Gesamtkosten über drei Jahre: Hardware, Lizenzen, Hosting, KI-Nutzung, Wartung.</w:t>
+        <w:t xml:space="preserve"> Je Paket die vorausgesetzte Eigenleistung des Büros mit der KI in Tagen und der Zeitbedarf des Inhabers je Woche, samt Wartungsfenstern.</w:t>
       </w:r>
     </w:p>
     <w:p>
@@ -3791,10 +4328,10 @@
         <w:rPr>
           <w:b/>
         </w:rPr>
-        <w:t>09.4 Team.</w:t>
+        <w:t>09.4 Varianten.</w:t>
       </w:r>
       <w:r>
-        <w:t xml:space="preserve"> Wer arbeitet, mit welcher Erfahrung in KI-Agenten-Plattformen, macOS- und Microsoft-365-Umgebungen und KMU-Betrieb. Referenzen, Verfügbarkeit, Stellvertretung.</w:t>
+        <w:t xml:space="preserve"> Mindestens zwei Architekturvarianten mit den Gesamtkosten über drei Jahre: Hardware, Lizenzen, Hosting, KI-Nutzung, Wartung. Dazu die kleinste sinnvolle Erstbestellung.</w:t>
       </w:r>
     </w:p>
     <w:p>
@@ -3802,7 +4339,29 @@
         <w:rPr>
           <w:b/>
         </w:rPr>
-        <w:t>09.5 Eigentum.</w:t>
+        <w:t>09.5 Dienste.</w:t>
+      </w:r>
+      <w:r>
+        <w:t xml:space="preserve"> Welche Dienste Sie selbst betreiben, welche Sie gemanagt beziehen, mit Datenstandort und Auftragsbearbeitungsvertrag. Die Gesamtzahl.</w:t>
+      </w:r>
+    </w:p>
+    <w:p>
+      <w:r>
+        <w:rPr>
+          <w:b/>
+        </w:rPr>
+        <w:t>09.6 Team.</w:t>
+      </w:r>
+      <w:r>
+        <w:t xml:space="preserve"> Wer arbeitet, mit welcher Erfahrung in agentischen Systemen, macOS-Flotten als Worker, Microsoft Entra und Graph unter Least Privilege und im KMU-Betrieb. Referenzen, Verfügbarkeit, Stellvertretung.</w:t>
+      </w:r>
+    </w:p>
+    <w:p>
+      <w:r>
+        <w:rPr>
+          <w:b/>
+        </w:rPr>
+        <w:t>09.7 Eigentum.</w:t>
       </w:r>
       <w:r>
         <w:t xml:space="preserve"> Sämtliche Arbeitsergebnisse gehören dem Auftraggeber und liegen in seinem Repository.</w:t>
@@ -3813,10 +4372,10 @@
         <w:rPr>
           <w:b/>
         </w:rPr>
-        <w:t>09.6 Vertraulichkeit und Datenschutz.</w:t>
+        <w:t>09.8 Vertraulichkeit und Datenschutz.</w:t>
       </w:r>
       <w:r>
-        <w:t xml:space="preserve"> Geheimhaltungsvereinbarung vor Einsicht in den Befundkatalog. Zugriff nur mit persönlichen, protokollierten Konten. Vereinbarung zur Auftragsbearbeitung.</w:t>
+        <w:t xml:space="preserve"> Geheimhaltungsvereinbarung vor Einsicht in den Befundkatalog. Vereinbarung zur Auftragsbearbeitung. Zugriff nur mit persönlichen, protokollierten Konten.</w:t>
       </w:r>
     </w:p>
     <w:p>
@@ -3824,7 +4383,7 @@
         <w:rPr>
           <w:b/>
         </w:rPr>
-        <w:t>09.7 Haftung.</w:t>
+        <w:t>09.9 Haftung.</w:t>
       </w:r>
       <w:r>
         <w:t xml:space="preserve"> Nachweis der Berufshaftpflicht, Aussage zur Haftung für Datenverlust während der Migration.</w:t>
@@ -3835,7 +4394,7 @@
         <w:rPr>
           <w:b/>
         </w:rPr>
-        <w:t>09.8 Bindefrist.</w:t>
+        <w:t>09.10 Bindefrist.</w:t>
       </w:r>
       <w:r>
         <w:t xml:space="preserve"> Drei Monate ab Offertdatum.</w:t>
@@ -3857,7 +4416,7 @@
         <w:t>10.1 Standort der Plattform.</w:t>
       </w:r>
       <w:r>
-        <w:t xml:space="preserve"> Eigener Server im Büro, gehostet in der Schweiz oder EU, oder Mischform? Wie erreichen Sie den unbeaufsichtigten Wiederanlauf, ohne die Verschlüsselung abzubauen?</w:t>
+        <w:t xml:space="preserve"> Eigener Host im Büro, VM in der Schweiz oder EU, oder Mischform? Ab welcher Grösse oder welchem Risiko raten Sie zum einen oder anderen? Wie erreichen Sie den unbeaufsichtigten Wiederanlauf, ohne die Verschlüsselung abzubauen?</w:t>
       </w:r>
     </w:p>
     <w:p>
@@ -3868,7 +4427,7 @@
         <w:t>10.2 Job-System.</w:t>
       </w:r>
       <w:r>
-        <w:t xml:space="preserve"> Welches Werkzeug, und wie migrieren Sie 46 Routinen ohne Unterbruch der Aufsicht? Wie binden Sie den Mac-Worker ein?</w:t>
+        <w:t xml:space="preserve"> Welches Werkzeug für ein Ein-Personen-Büro, mit welchem Ausstiegsweg? Wie migrieren Sie 46 Routinen ohne Unterbruch der Aufsicht?</w:t>
       </w:r>
     </w:p>
     <w:p>
@@ -3879,7 +4438,7 @@
         <w:t>10.3 Agenten-Laufzeit.</w:t>
       </w:r>
       <w:r>
-        <w:t xml:space="preserve"> Abo oder API für unbeaufsichtigte Läufe: was lassen die Nutzungsbedingungen zu, was kostet es bei heutigem Volumen (Journalwert rund USD 2'400 API-Äquivalent in 7.5 Wochen, ohne die App-Routinen), wie deckeln Sie?</w:t>
+        <w:t xml:space="preserve"> Abo oder API für unbeaufsichtigte Läufe: was lassen die aktuellen Bedingungen des Anbieters zu, was kostet es? Das Journal weist rund USD 2'400 API-Äquivalent in 7.5 Wochen aus, vor Bereinigung der Fehlläufe und ohne die App-Routinen. Wie sieht das System aus, wenn nur fünf bis zehn operative Jobs unbeaufsichtigt laufen dürfen?</w:t>
       </w:r>
     </w:p>
     <w:p>
@@ -3890,7 +4449,7 @@
         <w:t>10.4 Agentische Sicherheit.</w:t>
       </w:r>
       <w:r>
-        <w:t xml:space="preserve"> Wie trennen Sie lesende von handelnden Agenten, wie sieht Ihre Freigabeschicht aus, wie testen Sie sie?</w:t>
+        <w:t xml:space="preserve"> Wie trennen Sie lesende von handelnden Agenten, wie isolieren Sie die Schreibzugänge, wie weisen Sie die Wirkung wiederkehrend nach?</w:t>
       </w:r>
     </w:p>
     <w:p>
@@ -3898,10 +4457,10 @@
         <w:rPr>
           <w:b/>
         </w:rPr>
-        <w:t>10.5 Microsoft 365.</w:t>
+        <w:t>10.5 Mac-Worker.</w:t>
       </w:r>
       <w:r>
-        <w:t xml:space="preserve"> Wie schneiden Sie die Rechte zu, und wie ersetzen Sie kopierte Schlüssel?</w:t>
+        <w:t xml:space="preserve"> Wie betreiben Sie Mail-Versand, CAD und Render als Dienst neben interaktiver Arbeit, nach einem Neustart und ohne ruhende Secrets? Lässt sich der Mailweg über Entwürfe im Postfach vereinfachen?</w:t>
       </w:r>
     </w:p>
     <w:p>
@@ -3909,10 +4468,10 @@
         <w:rPr>
           <w:b/>
         </w:rPr>
-        <w:t>10.6 Secrets.</w:t>
+        <w:t>10.6 Microsoft 365 und Secrets.</w:t>
       </w:r>
       <w:r>
-        <w:t xml:space="preserve"> Welches Produkt, welche Rotation, wie kommen unbeaufsichtigte Läufe an ihre Zugänge?</w:t>
+        <w:t xml:space="preserve"> Wie schneiden Sie die Rechte zu, welches Produkt für Secrets, welche Rotation?</w:t>
       </w:r>
     </w:p>
     <w:p>
@@ -3923,7 +4482,7 @@
         <w:t>10.7 Datenschnitt.</w:t>
       </w:r>
       <w:r>
-        <w:t xml:space="preserve"> Was bleibt in Git, was geht in Datenbank und Objektspeicher? Wie gehen Sie mit der bestehenden Historie um?</w:t>
+        <w:t xml:space="preserve"> Was bleibt in Git, was geht in Datenbank und Objektspeicher? Was muss für die spätere Mandantentrennung jetzt schon im Datenmodell stehen?</w:t>
       </w:r>
     </w:p>
     <w:p>
@@ -3931,10 +4490,10 @@
         <w:rPr>
           <w:b/>
         </w:rPr>
-        <w:t>10.8 Wissensplattform.</w:t>
+        <w:t>10.8 Backup.</w:t>
       </w:r>
       <w:r>
-        <w:t xml:space="preserve"> Welcher Such-Stack, selbst gehostet, für rund 1'700 Artikel heute und ein Archiv von 1.9 TB dahinter?</w:t>
+        <w:t xml:space="preserve"> Ihr Vorschlag für 6 TB Bürodaten, Microsoft 365, bexio und den Host, mit Standorten, Monatskosten und Probeplan.</w:t>
       </w:r>
     </w:p>
     <w:p>
@@ -3942,10 +4501,10 @@
         <w:rPr>
           <w:b/>
         </w:rPr>
-        <w:t>10.9 Backup.</w:t>
+        <w:t>10.9 Monitoring.</w:t>
       </w:r>
       <w:r>
-        <w:t xml:space="preserve"> Ihr Vorschlag für 6 TB Bürodaten, Microsoft 365 und bexio, mit RPO, RTO und Probe.</w:t>
+        <w:t xml:space="preserve"> Welcher Stack ohne Dashboard-Ballast, welcher Alarmkanal, was kostet er im Monat?</w:t>
       </w:r>
     </w:p>
     <w:p>
@@ -3953,10 +4512,10 @@
         <w:rPr>
           <w:b/>
         </w:rPr>
-        <w:t>10.10 Monitoring.</w:t>
+        <w:t>10.10 Datenschutz.</w:t>
       </w:r>
       <w:r>
-        <w:t xml:space="preserve"> Welcher Stack, welcher Alarmkanal, was kostet er im Monat?</w:t>
+        <w:t xml:space="preserve"> Was decken Sie ab, wofür braucht es eine Rechtsfachperson, und in welcher Reihenfolge?</w:t>
       </w:r>
     </w:p>
     <w:p>
@@ -3964,10 +4523,10 @@
         <w:rPr>
           <w:b/>
         </w:rPr>
-        <w:t>10.11 Datenschutz.</w:t>
+        <w:t>10.11 KI-Bedienbarkeit.</w:t>
       </w:r>
       <w:r>
-        <w:t xml:space="preserve"> Was decken Sie ab, wofür braucht es eine Rechtsfachperson?</w:t>
+        <w:t xml:space="preserve"> Was darf die KI über Vorschläge ändern, welche Prüfungen blockieren, wie bleibt der Inhaber dabei nicht der Engpass?</w:t>
       </w:r>
     </w:p>
     <w:p>
@@ -3978,7 +4537,7 @@
         <w:t>10.12 Betrieb.</w:t>
       </w:r>
       <w:r>
-        <w:t xml:space="preserve"> Reaktionszeiten, Stellvertretung, Fernzugriff, Dokumentation, Ausstieg.</w:t>
+        <w:t xml:space="preserve"> Reaktionszeiten, Patch-Rhythmus, Stellvertretung, Fernzugriff, Ausstieg.</w:t>
       </w:r>
     </w:p>
     <w:p>
@@ -3986,10 +4545,10 @@
         <w:rPr>
           <w:b/>
         </w:rPr>
-        <w:t>10.13 Umgang mit KI-gebautem Code.</w:t>
+        <w:t>10.13 Streichen.</w:t>
       </w:r>
       <w:r>
-        <w:t xml:space="preserve"> Was übernehmen Sie, was schreiben Sie neu, wie führen Sie Tests und Evals ein?</w:t>
+        <w:t xml:space="preserve"> Welche der 84 Scripts und 22 Wächter streichen Sie ersatzlos, welche übernehmen Sie als Anforderung? Was würden Sie für ein Büro mit ein bis sechs Personen ganz weglassen?</w:t>
       </w:r>
     </w:p>
     <w:p>
@@ -3997,10 +4556,10 @@
         <w:rPr>
           <w:b/>
         </w:rPr>
-        <w:t>10.14 Reihenfolge.</w:t>
+        <w:t>10.14 Widerspruch.</w:t>
       </w:r>
       <w:r>
-        <w:t xml:space="preserve"> Was würden Sie anders schneiden oder früher tun als in Abschnitt 08?</w:t>
+        <w:t xml:space="preserve"> Welche Risiken fehlen in den Befunden, und welche Annahmen dieser Anfrage halten Sie für falsch?</w:t>
       </w:r>
     </w:p>
     <w:p>
@@ -4013,7 +4572,7 @@
     </w:p>
     <w:tbl>
       <w:tblPr>
-        <w:tblW w:type="auto" w:w="0"/>
+        <w:tblW w:type="dxa" w:w="7938"/>
         <w:tblLayout w:type="fixed"/>
         <w:tblLook w:firstColumn="1" w:firstRow="1" w:lastColumn="0" w:lastRow="0" w:noHBand="0" w:noVBand="1" w:val="04A0"/>
         <w:tblBorders>
@@ -4026,8 +4585,8 @@
         </w:tblBorders>
       </w:tblPr>
       <w:tblGrid>
-        <w:gridCol w:w="4819"/>
-        <w:gridCol w:w="4819"/>
+        <w:gridCol w:w="6237"/>
+        <w:gridCol w:w="1701"/>
       </w:tblGrid>
       <w:tr>
         <w:trPr>
@@ -4035,7 +4594,7 @@
         </w:trPr>
         <w:tc>
           <w:tcPr>
-            <w:tcW w:type="dxa" w:w="3402"/>
+            <w:tcW w:type="dxa" w:w="6236"/>
           </w:tcPr>
           <w:p>
             <w:pPr>
@@ -4053,7 +4612,7 @@
         </w:tc>
         <w:tc>
           <w:tcPr>
-            <w:tcW w:type="dxa" w:w="6236"/>
+            <w:tcW w:type="dxa" w:w="1701"/>
           </w:tcPr>
           <w:p>
             <w:pPr>
@@ -4076,7 +4635,7 @@
         </w:trPr>
         <w:tc>
           <w:tcPr>
-            <w:tcW w:type="dxa" w:w="3402"/>
+            <w:tcW w:type="dxa" w:w="6236"/>
           </w:tcPr>
           <w:p>
             <w:pPr>
@@ -4093,7 +4652,7 @@
         </w:tc>
         <w:tc>
           <w:tcPr>
-            <w:tcW w:type="dxa" w:w="6236"/>
+            <w:tcW w:type="dxa" w:w="1701"/>
           </w:tcPr>
           <w:p>
             <w:pPr>
@@ -4115,7 +4674,7 @@
         </w:trPr>
         <w:tc>
           <w:tcPr>
-            <w:tcW w:type="dxa" w:w="3402"/>
+            <w:tcW w:type="dxa" w:w="6236"/>
           </w:tcPr>
           <w:p>
             <w:pPr>
@@ -4132,7 +4691,7 @@
         </w:tc>
         <w:tc>
           <w:tcPr>
-            <w:tcW w:type="dxa" w:w="6236"/>
+            <w:tcW w:type="dxa" w:w="1701"/>
           </w:tcPr>
           <w:p>
             <w:pPr>
@@ -4154,7 +4713,7 @@
         </w:trPr>
         <w:tc>
           <w:tcPr>
-            <w:tcW w:type="dxa" w:w="3402"/>
+            <w:tcW w:type="dxa" w:w="6236"/>
           </w:tcPr>
           <w:p>
             <w:pPr>
@@ -4171,7 +4730,7 @@
         </w:tc>
         <w:tc>
           <w:tcPr>
-            <w:tcW w:type="dxa" w:w="6236"/>
+            <w:tcW w:type="dxa" w:w="1701"/>
           </w:tcPr>
           <w:p>
             <w:pPr>
@@ -4193,7 +4752,7 @@
         </w:trPr>
         <w:tc>
           <w:tcPr>
-            <w:tcW w:type="dxa" w:w="3402"/>
+            <w:tcW w:type="dxa" w:w="6236"/>
           </w:tcPr>
           <w:p>
             <w:pPr>
@@ -4210,7 +4769,7 @@
         </w:tc>
         <w:tc>
           <w:tcPr>
-            <w:tcW w:type="dxa" w:w="6236"/>
+            <w:tcW w:type="dxa" w:w="1701"/>
           </w:tcPr>
           <w:p>
             <w:pPr>
@@ -4232,7 +4791,7 @@
         </w:trPr>
         <w:tc>
           <w:tcPr>
-            <w:tcW w:type="dxa" w:w="3402"/>
+            <w:tcW w:type="dxa" w:w="6236"/>
           </w:tcPr>
           <w:p>
             <w:pPr>
@@ -4249,7 +4808,7 @@
         </w:tc>
         <w:tc>
           <w:tcPr>
-            <w:tcW w:type="dxa" w:w="6236"/>
+            <w:tcW w:type="dxa" w:w="1701"/>
           </w:tcPr>
           <w:p>
             <w:pPr>

</xml_diff>